<commit_message>
Actualizar documento formal con matrices de prueba y diagramas MER y logico
</commit_message>
<xml_diff>
--- a/docs/ProyectoFinalSOftware_backup.docx
+++ b/docs/ProyectoFinalSOftware_backup.docx
@@ -4659,7 +4659,56 @@
                 <w:sz w:val="18"/>
                 <w:szCs w:val="18"/>
               </w:rPr>
-              <w:t>JEFE DE PROYECTO / Scrum Master y Arquitecto de Software</w:t>
+              <w:t xml:space="preserve">JEFE DE PROYECTO </w:t>
+            </w:r>
+            <w:r>
+              <w:rPr>
+                <w:sz w:val="18"/>
+                <w:szCs w:val="18"/>
+              </w:rPr>
+              <w:t>Y DESARROLLADOR</w:t>
+            </w:r>
+            <w:r>
+              <w:rPr>
+                <w:sz w:val="18"/>
+                <w:szCs w:val="18"/>
+              </w:rPr>
+              <w:t xml:space="preserve">/ Scrum Master </w:t>
+            </w:r>
+            <w:r>
+              <w:rPr>
+                <w:sz w:val="18"/>
+                <w:szCs w:val="18"/>
+              </w:rPr>
+              <w:t xml:space="preserve">y </w:t>
+            </w:r>
+            <w:r>
+              <w:rPr>
+                <w:sz w:val="18"/>
+                <w:szCs w:val="18"/>
+              </w:rPr>
+              <w:t>P</w:t>
+            </w:r>
+            <w:r>
+              <w:rPr>
+                <w:sz w:val="18"/>
+                <w:szCs w:val="18"/>
+              </w:rPr>
+              <w:t xml:space="preserve">arte del </w:t>
+            </w:r>
+            <w:r>
+              <w:rPr>
+                <w:sz w:val="18"/>
+                <w:szCs w:val="18"/>
+              </w:rPr>
+              <w:t>E</w:t>
+            </w:r>
+            <w:r>
+              <w:rPr>
+                <w:sz w:val="18"/>
+                <w:szCs w:val="18"/>
+              </w:rPr>
+              <w:t>quipo de desarrollo</w:t>
             </w:r>
           </w:p>
         </w:tc>
@@ -4679,17 +4728,15 @@
                 <w:sz w:val="18"/>
                 <w:szCs w:val="18"/>
               </w:rPr>
-              <w:t>Encargado de liderar al equipo bajo la metodología Scrum, facilitando los procesos y eliminando impedimentos. Define la arquitectura lógica y física del sistema y los patrones de integración con PeruRail, SENAMHI y Travel Group Perú.</w:t>
-            </w:r>
-          </w:p>
-          <w:p>
-            <w:pPr>
-              <w:jc w:val="center"/>
-              <w:rPr>
-                <w:sz w:val="18"/>
-                <w:szCs w:val="18"/>
-              </w:rPr>
-            </w:pPr>
+              <w:t xml:space="preserve">Encargado de liderar al equipo bajo la metodología Scrum, facilitando los procesos y eliminando impedimentos. </w:t>
+            </w:r>
+            <w:r>
+              <w:rPr>
+                <w:sz w:val="18"/>
+                <w:szCs w:val="18"/>
+              </w:rPr>
+              <w:t>Responsable de implementar la persistencia, la lógica de negocio en el backend, las integraciones con los servicios externos y la interfaz web responsive del sistema.</w:t>
+            </w:r>
           </w:p>
         </w:tc>
       </w:tr>
@@ -4730,7 +4777,21 @@
                 <w:sz w:val="18"/>
                 <w:szCs w:val="18"/>
               </w:rPr>
-              <w:t>ASEGURADOR DE CALIDAD / Equipo de Desarrollo (QA/Tester)</w:t>
+              <w:t>A</w:t>
+            </w:r>
+            <w:r>
+              <w:rPr>
+                <w:sz w:val="18"/>
+                <w:szCs w:val="18"/>
+              </w:rPr>
+              <w:t>RQUITECTO DE SOFTWARE</w:t>
+            </w:r>
+            <w:r>
+              <w:rPr>
+                <w:sz w:val="18"/>
+                <w:szCs w:val="18"/>
+              </w:rPr>
+              <w:t>/ Equipo de Desarrollo</w:t>
             </w:r>
           </w:p>
         </w:tc>
@@ -4750,17 +4811,8 @@
                 <w:sz w:val="18"/>
                 <w:szCs w:val="18"/>
               </w:rPr>
-              <w:t>Responsable de planificar y diseñar las matrices de prueba de caja blanca y caja negra, así como de ejecutar y documentar las pruebas funcionales, de integración y de seguridad del sistema.</w:t>
-            </w:r>
-          </w:p>
-          <w:p>
-            <w:pPr>
-              <w:ind w:firstLine="708"/>
-              <w:rPr>
-                <w:sz w:val="18"/>
-                <w:szCs w:val="18"/>
-              </w:rPr>
-            </w:pPr>
+              <w:t>Define la arquitectura lógica y física del sistema y los patrones de integración con PeruRail, SENAMHI y Travel Group Perú.</w:t>
+            </w:r>
           </w:p>
         </w:tc>
       </w:tr>
@@ -4863,7 +4915,21 @@
                 <w:sz w:val="18"/>
                 <w:szCs w:val="18"/>
               </w:rPr>
-              <w:t>DESARROLLADOR FULL STACK / Equipo de Desarrollo</w:t>
+              <w:t>ASEGURADOR DE CALIDAD</w:t>
+            </w:r>
+            <w:r>
+              <w:rPr>
+                <w:sz w:val="18"/>
+                <w:szCs w:val="18"/>
+              </w:rPr>
+              <w:t xml:space="preserve">/ </w:t>
+            </w:r>
+            <w:r>
+              <w:rPr>
+                <w:sz w:val="18"/>
+                <w:szCs w:val="18"/>
+              </w:rPr>
+              <w:t>Equipo de Desarrollo (QA/Tester)</w:t>
             </w:r>
           </w:p>
         </w:tc>
@@ -4883,8 +4949,16 @@
                 <w:sz w:val="18"/>
                 <w:szCs w:val="18"/>
               </w:rPr>
-              <w:t>Responsable de implementar la persistencia, la lógica de negocio en el backend, las integraciones con los servicios externos y la interfaz web responsive del sistema.</w:t>
-            </w:r>
+              <w:t>Responsable de planificar y diseñar las matrices de prueba de caja blanca y caja negra, así como de ejecutar y documentar las pruebas funcionales, de integración y de seguridad del sistema.</w:t>
+            </w:r>
+          </w:p>
+          <w:p>
+            <w:pPr>
+              <w:rPr>
+                <w:sz w:val="18"/>
+                <w:szCs w:val="18"/>
+              </w:rPr>
+            </w:pPr>
           </w:p>
         </w:tc>
       </w:tr>
@@ -5508,6 +5582,49 @@
                 <w:szCs w:val="18"/>
               </w:rPr>
               <w:t>Validar disponibilidad de aforo de la zona turística</w:t>
+            </w:r>
+          </w:p>
+        </w:tc>
+      </w:tr>
+      <w:tr>
+        <w:tc>
+          <w:tcPr>
+            <w:tcW w:w="3893" w:type="dxa"/>
+          </w:tcPr>
+          <w:p>
+            <w:pPr>
+              <w:rPr>
+                <w:sz w:val="18"/>
+                <w:szCs w:val="18"/>
+              </w:rPr>
+            </w:pPr>
+            <w:r>
+              <w:rPr>
+                <w:sz w:val="18"/>
+                <w:szCs w:val="18"/>
+              </w:rPr>
+              <w:t>Usuario final</w:t>
+            </w:r>
+          </w:p>
+        </w:tc>
+        <w:tc>
+          <w:tcPr>
+            <w:tcW w:w="3893" w:type="dxa"/>
+            <w:vAlign w:val="center"/>
+          </w:tcPr>
+          <w:p>
+            <w:pPr>
+              <w:rPr>
+                <w:sz w:val="18"/>
+                <w:szCs w:val="18"/>
+              </w:rPr>
+            </w:pPr>
+            <w:r>
+              <w:rPr>
+                <w:sz w:val="18"/>
+                <w:szCs w:val="18"/>
+              </w:rPr>
+              <w:t>Consultar historial de informes de planificación</w:t>
             </w:r>
           </w:p>
         </w:tc>
@@ -8720,6 +8837,417 @@
         <w:tab/>
       </w:r>
     </w:p>
+    <w:tbl>
+      <w:tblPr>
+        <w:tblStyle w:val="Tablaconcuadrcula"/>
+        <w:tblW w:w="0" w:type="auto"/>
+        <w:tblInd w:w="708" w:type="dxa"/>
+        <w:tblLook w:val="04A0" w:firstRow="1" w:lastRow="0" w:firstColumn="1" w:lastColumn="0" w:noHBand="0" w:noVBand="1"/>
+      </w:tblPr>
+      <w:tblGrid>
+        <w:gridCol w:w="1555"/>
+        <w:gridCol w:w="6231"/>
+      </w:tblGrid>
+      <w:tr>
+        <w:tc>
+          <w:tcPr>
+            <w:tcW w:w="1555" w:type="dxa"/>
+            <w:shd w:val="clear" w:color="auto" w:fill="D1D1D1" w:themeFill="background2" w:themeFillShade="E6"/>
+          </w:tcPr>
+          <w:p>
+            <w:pPr>
+              <w:rPr>
+                <w:b/>
+                <w:bCs/>
+                <w:sz w:val="18"/>
+                <w:szCs w:val="18"/>
+              </w:rPr>
+            </w:pPr>
+            <w:r>
+              <w:rPr>
+                <w:b/>
+                <w:bCs/>
+                <w:sz w:val="18"/>
+                <w:szCs w:val="18"/>
+              </w:rPr>
+              <w:t>Código</w:t>
+            </w:r>
+          </w:p>
+        </w:tc>
+        <w:tc>
+          <w:tcPr>
+            <w:tcW w:w="6231" w:type="dxa"/>
+          </w:tcPr>
+          <w:p>
+            <w:pPr>
+              <w:rPr>
+                <w:sz w:val="18"/>
+                <w:szCs w:val="18"/>
+              </w:rPr>
+            </w:pPr>
+            <w:r>
+              <w:rPr>
+                <w:sz w:val="18"/>
+                <w:szCs w:val="18"/>
+              </w:rPr>
+              <w:t>CU-09</w:t>
+            </w:r>
+          </w:p>
+        </w:tc>
+      </w:tr>
+      <w:tr>
+        <w:tc>
+          <w:tcPr>
+            <w:tcW w:w="1555" w:type="dxa"/>
+            <w:shd w:val="clear" w:color="auto" w:fill="D1D1D1" w:themeFill="background2" w:themeFillShade="E6"/>
+          </w:tcPr>
+          <w:p>
+            <w:pPr>
+              <w:rPr>
+                <w:b/>
+                <w:bCs/>
+                <w:sz w:val="18"/>
+                <w:szCs w:val="18"/>
+              </w:rPr>
+            </w:pPr>
+            <w:r>
+              <w:rPr>
+                <w:b/>
+                <w:bCs/>
+                <w:sz w:val="18"/>
+                <w:szCs w:val="18"/>
+              </w:rPr>
+              <w:t>Actor</w:t>
+            </w:r>
+          </w:p>
+        </w:tc>
+        <w:tc>
+          <w:tcPr>
+            <w:tcW w:w="6231" w:type="dxa"/>
+            <w:vAlign w:val="center"/>
+          </w:tcPr>
+          <w:p>
+            <w:pPr>
+              <w:rPr>
+                <w:sz w:val="18"/>
+                <w:szCs w:val="18"/>
+              </w:rPr>
+            </w:pPr>
+            <w:r>
+              <w:rPr>
+                <w:sz w:val="18"/>
+                <w:szCs w:val="18"/>
+              </w:rPr>
+              <w:t>Usuario final (Turista)</w:t>
+            </w:r>
+          </w:p>
+        </w:tc>
+      </w:tr>
+      <w:tr>
+        <w:tc>
+          <w:tcPr>
+            <w:tcW w:w="1555" w:type="dxa"/>
+            <w:shd w:val="clear" w:color="auto" w:fill="D1D1D1" w:themeFill="background2" w:themeFillShade="E6"/>
+          </w:tcPr>
+          <w:p>
+            <w:pPr>
+              <w:rPr>
+                <w:b/>
+                <w:bCs/>
+                <w:sz w:val="18"/>
+                <w:szCs w:val="18"/>
+              </w:rPr>
+            </w:pPr>
+            <w:r>
+              <w:rPr>
+                <w:b/>
+                <w:bCs/>
+                <w:sz w:val="18"/>
+                <w:szCs w:val="18"/>
+              </w:rPr>
+              <w:t>Caso de uso</w:t>
+            </w:r>
+          </w:p>
+        </w:tc>
+        <w:tc>
+          <w:tcPr>
+            <w:tcW w:w="6231" w:type="dxa"/>
+            <w:vAlign w:val="center"/>
+          </w:tcPr>
+          <w:p>
+            <w:pPr>
+              <w:rPr>
+                <w:sz w:val="18"/>
+                <w:szCs w:val="18"/>
+              </w:rPr>
+            </w:pPr>
+            <w:r>
+              <w:rPr>
+                <w:sz w:val="18"/>
+                <w:szCs w:val="18"/>
+              </w:rPr>
+              <w:t>Consultar historial de informes de planificación</w:t>
+            </w:r>
+          </w:p>
+        </w:tc>
+      </w:tr>
+      <w:tr>
+        <w:tc>
+          <w:tcPr>
+            <w:tcW w:w="1555" w:type="dxa"/>
+            <w:shd w:val="clear" w:color="auto" w:fill="D1D1D1" w:themeFill="background2" w:themeFillShade="E6"/>
+          </w:tcPr>
+          <w:p>
+            <w:pPr>
+              <w:rPr>
+                <w:b/>
+                <w:bCs/>
+                <w:sz w:val="18"/>
+                <w:szCs w:val="18"/>
+              </w:rPr>
+            </w:pPr>
+            <w:r>
+              <w:rPr>
+                <w:b/>
+                <w:bCs/>
+                <w:sz w:val="18"/>
+                <w:szCs w:val="18"/>
+              </w:rPr>
+              <w:t>Descripcion</w:t>
+            </w:r>
+          </w:p>
+        </w:tc>
+        <w:tc>
+          <w:tcPr>
+            <w:tcW w:w="6231" w:type="dxa"/>
+            <w:vAlign w:val="center"/>
+          </w:tcPr>
+          <w:p>
+            <w:pPr>
+              <w:rPr>
+                <w:sz w:val="18"/>
+                <w:szCs w:val="18"/>
+              </w:rPr>
+            </w:pPr>
+            <w:r>
+              <w:rPr>
+                <w:sz w:val="18"/>
+                <w:szCs w:val="18"/>
+              </w:rPr>
+              <w:t>El usuario autenticado accede a la pestaña Mis Informes para consultar el listado cronológico de todos los informes de planificación emitidos previamente con su cuenta, con acceso directo a visualizarlos en pantalla o descargarlos en archivo PDF.</w:t>
+            </w:r>
+          </w:p>
+        </w:tc>
+      </w:tr>
+      <w:tr>
+        <w:tc>
+          <w:tcPr>
+            <w:tcW w:w="1555" w:type="dxa"/>
+            <w:shd w:val="clear" w:color="auto" w:fill="D1D1D1" w:themeFill="background2" w:themeFillShade="E6"/>
+          </w:tcPr>
+          <w:p>
+            <w:pPr>
+              <w:rPr>
+                <w:b/>
+                <w:bCs/>
+                <w:sz w:val="18"/>
+                <w:szCs w:val="18"/>
+              </w:rPr>
+            </w:pPr>
+            <w:r>
+              <w:rPr>
+                <w:b/>
+                <w:bCs/>
+                <w:sz w:val="18"/>
+                <w:szCs w:val="18"/>
+              </w:rPr>
+              <w:t>Precondición</w:t>
+            </w:r>
+          </w:p>
+        </w:tc>
+        <w:tc>
+          <w:tcPr>
+            <w:tcW w:w="6231" w:type="dxa"/>
+            <w:vAlign w:val="center"/>
+          </w:tcPr>
+          <w:p>
+            <w:pPr>
+              <w:rPr>
+                <w:sz w:val="18"/>
+                <w:szCs w:val="18"/>
+              </w:rPr>
+            </w:pPr>
+            <w:r>
+              <w:rPr>
+                <w:sz w:val="18"/>
+                <w:szCs w:val="18"/>
+              </w:rPr>
+              <w:t>El usuario ha iniciado sesión con su cuenta (rol TURISTA_PUBLICO o superior) y ha generado previamente uno o más informes de visita.</w:t>
+            </w:r>
+          </w:p>
+        </w:tc>
+      </w:tr>
+      <w:tr>
+        <w:tc>
+          <w:tcPr>
+            <w:tcW w:w="1555" w:type="dxa"/>
+            <w:shd w:val="clear" w:color="auto" w:fill="D1D1D1" w:themeFill="background2" w:themeFillShade="E6"/>
+          </w:tcPr>
+          <w:p>
+            <w:pPr>
+              <w:rPr>
+                <w:b/>
+                <w:bCs/>
+                <w:sz w:val="18"/>
+                <w:szCs w:val="18"/>
+              </w:rPr>
+            </w:pPr>
+            <w:r>
+              <w:rPr>
+                <w:b/>
+                <w:bCs/>
+                <w:sz w:val="18"/>
+                <w:szCs w:val="18"/>
+              </w:rPr>
+              <w:t>Flujo principal</w:t>
+            </w:r>
+          </w:p>
+        </w:tc>
+        <w:tc>
+          <w:tcPr>
+            <w:tcW w:w="6231" w:type="dxa"/>
+            <w:vAlign w:val="center"/>
+          </w:tcPr>
+          <w:p>
+            <w:pPr>
+              <w:rPr>
+                <w:sz w:val="18"/>
+                <w:szCs w:val="18"/>
+              </w:rPr>
+            </w:pPr>
+            <w:r>
+              <w:rPr>
+                <w:sz w:val="18"/>
+                <w:szCs w:val="18"/>
+              </w:rPr>
+              <w:t xml:space="preserve">1) El usuario accede a la pestaña "Mis Informes". </w:t>
+            </w:r>
+          </w:p>
+          <w:p>
+            <w:pPr>
+              <w:rPr>
+                <w:sz w:val="18"/>
+                <w:szCs w:val="18"/>
+              </w:rPr>
+            </w:pPr>
+            <w:r>
+              <w:rPr>
+                <w:sz w:val="18"/>
+                <w:szCs w:val="18"/>
+              </w:rPr>
+              <w:t xml:space="preserve">2) El sistema consulta los informes asociados al usuario y los presenta en una tabla con código, fechas, destino y costo. </w:t>
+            </w:r>
+          </w:p>
+          <w:p>
+            <w:pPr>
+              <w:rPr>
+                <w:sz w:val="18"/>
+                <w:szCs w:val="18"/>
+              </w:rPr>
+            </w:pPr>
+            <w:r>
+              <w:rPr>
+                <w:sz w:val="18"/>
+                <w:szCs w:val="18"/>
+              </w:rPr>
+              <w:t xml:space="preserve">3) El usuario selecciona la opción "Ver" (HTML) o "PDF" para revisar o descargar el consolidado. </w:t>
+            </w:r>
+          </w:p>
+          <w:p>
+            <w:pPr>
+              <w:rPr>
+                <w:sz w:val="18"/>
+                <w:szCs w:val="18"/>
+              </w:rPr>
+            </w:pPr>
+            <w:r>
+              <w:rPr>
+                <w:sz w:val="18"/>
+                <w:szCs w:val="18"/>
+              </w:rPr>
+              <w:t>4) El sistema recupera los datos y emite el documento sin volver a descontar aforo.</w:t>
+            </w:r>
+          </w:p>
+        </w:tc>
+      </w:tr>
+      <w:tr>
+        <w:tc>
+          <w:tcPr>
+            <w:tcW w:w="1555" w:type="dxa"/>
+            <w:shd w:val="clear" w:color="auto" w:fill="D1D1D1" w:themeFill="background2" w:themeFillShade="E6"/>
+          </w:tcPr>
+          <w:p>
+            <w:pPr>
+              <w:rPr>
+                <w:b/>
+                <w:bCs/>
+                <w:sz w:val="18"/>
+                <w:szCs w:val="18"/>
+              </w:rPr>
+            </w:pPr>
+            <w:r>
+              <w:rPr>
+                <w:b/>
+                <w:bCs/>
+                <w:sz w:val="18"/>
+                <w:szCs w:val="18"/>
+              </w:rPr>
+              <w:t>Postcondición</w:t>
+            </w:r>
+          </w:p>
+        </w:tc>
+        <w:tc>
+          <w:tcPr>
+            <w:tcW w:w="6231" w:type="dxa"/>
+            <w:vAlign w:val="center"/>
+          </w:tcPr>
+          <w:p>
+            <w:pPr>
+              <w:rPr>
+                <w:sz w:val="18"/>
+                <w:szCs w:val="18"/>
+              </w:rPr>
+            </w:pPr>
+            <w:r>
+              <w:rPr>
+                <w:sz w:val="18"/>
+                <w:szCs w:val="18"/>
+              </w:rPr>
+              <w:t>El usuario visualiza su historial y obtiene acceso a los informes solicitados.</w:t>
+            </w:r>
+          </w:p>
+        </w:tc>
+      </w:tr>
+    </w:tbl>
+    <w:p>
+      <w:pPr>
+        <w:rPr>
+          <w:b/>
+          <w:bCs/>
+          <w:sz w:val="28"/>
+          <w:szCs w:val="28"/>
+        </w:rPr>
+      </w:pPr>
+      <w:r>
+        <w:rPr>
+          <w:b/>
+          <w:bCs/>
+          <w:sz w:val="28"/>
+          <w:szCs w:val="28"/>
+        </w:rPr>
+        <w:tab/>
+      </w:r>
+    </w:p>
     <w:p>
       <w:pPr>
         <w:pStyle w:val="Ttulo2"/>
@@ -8874,7 +9402,11 @@
         <w:t xml:space="preserve">RF-03 (Alta): </w:t>
       </w:r>
       <w:r>
-        <w:t>El sistema debe mostrar las zonas turísticas alcanzables a pie, recortando el listado conforme el usuario añade filtros (estación de partida, preferencia, tiempo disponible y dificultad máxima). Sin filtros declarados se muestra el catálogo completo, de modo que el usuario pueda explorar primero y precisar después.</w:t>
+        <w:t xml:space="preserve">El sistema debe mostrar las zonas turísticas alcanzables a pie, recortando el listado conforme el usuario añade filtros (estación de partida, preferencia, tiempo disponible y dificultad máxima). Sin filtros </w:t>
+      </w:r>
+      <w:r>
+        <w:lastRenderedPageBreak/>
+        <w:t>declarados se muestra el catálogo completo, de modo que el usuario pueda explorar primero y precisar después.</w:t>
       </w:r>
     </w:p>
     <w:p>
@@ -9032,7 +9564,6 @@
           <w:b/>
           <w:bCs/>
         </w:rPr>
-        <w:lastRenderedPageBreak/>
         <w:t xml:space="preserve">RF-08 (Alta): </w:t>
       </w:r>
       <w:r>
@@ -9066,6 +9597,27 @@
     </w:p>
     <w:p>
       <w:pPr>
+        <w:pStyle w:val="Prrafodelista"/>
+        <w:numPr>
+          <w:ilvl w:val="0"/>
+          <w:numId w:val="7"/>
+        </w:numPr>
+        <w:spacing w:after="120"/>
+        <w:jc w:val="both"/>
+      </w:pPr>
+      <w:r>
+        <w:rPr>
+          <w:b/>
+          <w:bCs/>
+        </w:rPr>
+        <w:t xml:space="preserve">RF-10 (Media): </w:t>
+      </w:r>
+      <w:r>
+        <w:t>El sistema debe permitir a los usuarios autenticados con rol TURISTA_PUBLICO (o superior) consultar el historial cronológico de los informes de planificación que hayan emitido previamente, permitiéndoles visualizar el detalle en formato HTML y descargar nuevamente el informe consolidado en PDF sin volver a consumir cupos de aforo.</w:t>
+      </w:r>
+    </w:p>
+    <w:p>
+      <w:pPr>
         <w:spacing w:after="200"/>
         <w:ind w:left="708" w:firstLine="708"/>
         <w:jc w:val="both"/>
@@ -9101,7 +9653,21 @@
           <w:b/>
           <w:bCs/>
         </w:rPr>
-        <w:t xml:space="preserve">RF-10 (Alta): </w:t>
+        <w:t>RF-1</w:t>
+      </w:r>
+      <w:r>
+        <w:rPr>
+          <w:b/>
+          <w:bCs/>
+        </w:rPr>
+        <w:t>1</w:t>
+      </w:r>
+      <w:r>
+        <w:rPr>
+          <w:b/>
+          <w:bCs/>
+        </w:rPr>
+        <w:t xml:space="preserve"> (Alta): </w:t>
       </w:r>
       <w:r>
         <w:t>El sistema debe permitir a Travel Group Perú registrar, actualizar y eliminar zonas turísticas (CRUD).</w:t>
@@ -9126,7 +9692,21 @@
           <w:b/>
           <w:bCs/>
         </w:rPr>
-        <w:t xml:space="preserve">RF-11 (Media): </w:t>
+        <w:t>RF-1</w:t>
+      </w:r>
+      <w:r>
+        <w:rPr>
+          <w:b/>
+          <w:bCs/>
+        </w:rPr>
+        <w:t>2</w:t>
+      </w:r>
+      <w:r>
+        <w:rPr>
+          <w:b/>
+          <w:bCs/>
+        </w:rPr>
+        <w:t xml:space="preserve"> (Media): </w:t>
       </w:r>
       <w:r>
         <w:t>El sistema debe permitir a Travel Group Perú consultar el listado de estaciones en modo de solo lectura.</w:t>
@@ -9151,18 +9731,24 @@
           <w:b/>
           <w:bCs/>
         </w:rPr>
-        <w:t xml:space="preserve">RF-12 (Media): </w:t>
+        <w:t>RF-1</w:t>
       </w:r>
       <w:r>
-        <w:t xml:space="preserve">El sistema debe permitir a un administrador de </w:t>
+        <w:rPr>
+          <w:b/>
+          <w:bCs/>
+        </w:rPr>
+        <w:t>3</w:t>
       </w:r>
-      <w:proofErr w:type="spellStart"/>
       <w:r>
-        <w:t>PeruRail</w:t>
+        <w:rPr>
+          <w:b/>
+          <w:bCs/>
+        </w:rPr>
+        <w:t xml:space="preserve"> (Media): </w:t>
       </w:r>
-      <w:proofErr w:type="spellEnd"/>
       <w:r>
-        <w:t xml:space="preserve"> (rol PERURAIL_ADMIN) y al administrador del MTC mantener los horarios y tarifas de los servicios de tren (</w:t>
+        <w:t>El sistema debe permitir a un administrador de PeruRail (rol PERURAIL_ADMIN) y al administrador del MTC mantener los horarios y tarifas de los servicios de tren (</w:t>
       </w:r>
       <w:r>
         <w:t>E</w:t>
@@ -9207,7 +9793,21 @@
           <w:b/>
           <w:bCs/>
         </w:rPr>
-        <w:t xml:space="preserve">RF-13 (Alta): </w:t>
+        <w:t>RF-1</w:t>
+      </w:r>
+      <w:r>
+        <w:rPr>
+          <w:b/>
+          <w:bCs/>
+        </w:rPr>
+        <w:t>4</w:t>
+      </w:r>
+      <w:r>
+        <w:rPr>
+          <w:b/>
+          <w:bCs/>
+        </w:rPr>
+        <w:t xml:space="preserve"> (Alta): </w:t>
       </w:r>
       <w:r>
         <w:t>El sistema debe sincronizar periódicamente los datos de estaciones, horarios y tarifas provenientes de PeruRail.</w:t>
@@ -9228,7 +9828,21 @@
           <w:b/>
           <w:bCs/>
         </w:rPr>
-        <w:t xml:space="preserve">RF-14 (Alta): </w:t>
+        <w:t>RF-1</w:t>
+      </w:r>
+      <w:r>
+        <w:rPr>
+          <w:b/>
+          <w:bCs/>
+        </w:rPr>
+        <w:t>5</w:t>
+      </w:r>
+      <w:r>
+        <w:rPr>
+          <w:b/>
+          <w:bCs/>
+        </w:rPr>
+        <w:t xml:space="preserve"> (Alta): </w:t>
       </w:r>
       <w:r>
         <w:t>El sistema debe sincronizar periódicamente las previsiones climáticas provenientes del SENAMHI.</w:t>
@@ -9249,7 +9863,21 @@
           <w:b/>
           <w:bCs/>
         </w:rPr>
-        <w:t xml:space="preserve">RF-15 (Media): </w:t>
+        <w:t>RF-1</w:t>
+      </w:r>
+      <w:r>
+        <w:rPr>
+          <w:b/>
+          <w:bCs/>
+        </w:rPr>
+        <w:t>6</w:t>
+      </w:r>
+      <w:r>
+        <w:rPr>
+          <w:b/>
+          <w:bCs/>
+        </w:rPr>
+        <w:t xml:space="preserve"> (Media): </w:t>
       </w:r>
       <w:r>
         <w:t>El sistema debe registrar en un log de auditoría cada sincronización externa y cada operación administrativa (CRUD) realizada sobre zonas turísticas, horarios y precios.</w:t>
@@ -9292,7 +9920,22 @@
           <w:b/>
           <w:bCs/>
         </w:rPr>
-        <w:t xml:space="preserve">RF-16 (Alta): </w:t>
+        <w:lastRenderedPageBreak/>
+        <w:t>RF-1</w:t>
+      </w:r>
+      <w:r>
+        <w:rPr>
+          <w:b/>
+          <w:bCs/>
+        </w:rPr>
+        <w:t>7</w:t>
+      </w:r>
+      <w:r>
+        <w:rPr>
+          <w:b/>
+          <w:bCs/>
+        </w:rPr>
+        <w:t xml:space="preserve"> (Alta): </w:t>
       </w:r>
       <w:r>
         <w:t>El sistema debe validar el aforo (cupo máximo diario) de la zona turística seleccionada, cuando esta lo tenga configurado, antes de confirmar la generación del informe consolidado. La validación se hace por el número total de personas del grupo: el grupo se acepta completo o se rechaza entero, y en caso de rechazo el sistema sugiere la primera fecha posterior con cupo suficiente para todas ellas.</w:t>
@@ -9313,7 +9956,21 @@
           <w:b/>
           <w:bCs/>
         </w:rPr>
-        <w:t xml:space="preserve">RF-17 (Media): </w:t>
+        <w:t>RF-1</w:t>
+      </w:r>
+      <w:r>
+        <w:rPr>
+          <w:b/>
+          <w:bCs/>
+        </w:rPr>
+        <w:t>8</w:t>
+      </w:r>
+      <w:r>
+        <w:rPr>
+          <w:b/>
+          <w:bCs/>
+        </w:rPr>
+        <w:t xml:space="preserve"> (Media): </w:t>
       </w:r>
       <w:r>
         <w:t>El sistema debe permitir a Travel Group Perú configurar y actualizar el cupo máximo diario de una zona turística como parte del CRUD de zonas turísticas.</w:t>
@@ -9352,7 +10009,21 @@
           <w:b/>
           <w:bCs/>
         </w:rPr>
-        <w:t xml:space="preserve">RF-18 (Alta): </w:t>
+        <w:t>RF-1</w:t>
+      </w:r>
+      <w:r>
+        <w:rPr>
+          <w:b/>
+          <w:bCs/>
+        </w:rPr>
+        <w:t>9</w:t>
+      </w:r>
+      <w:r>
+        <w:rPr>
+          <w:b/>
+          <w:bCs/>
+        </w:rPr>
+        <w:t xml:space="preserve"> (Alta): </w:t>
       </w:r>
       <w:r>
         <w:t>El sistema debe calcular la tarifa del tren y la entrada a la zona turística según la edad de cada integrante del grupo, aplicando los tramos de edad vigentes de cada proveedor. Los tramos no coinciden entre ambos: PeruRail cobra tarifa de adulto desde los 12 años, mientras que la entrada a la zona mantiene la tarifa reducida hasta los 17, por lo que un visitante de entre 12 y 17 años paga adulto en el tren y menor en la zona.</w:t>
@@ -9379,7 +10050,6 @@
           <w:sz w:val="22"/>
           <w:szCs w:val="22"/>
         </w:rPr>
-        <w:lastRenderedPageBreak/>
         <w:t>4.3.2. Requerimientos no funcionales</w:t>
       </w:r>
       <w:bookmarkEnd w:id="15"/>
@@ -9541,7 +10211,11 @@
         <w:t xml:space="preserve">RNF-08 – Concurrencia: </w:t>
       </w:r>
       <w:r>
-        <w:t>El incremento del contador de aforo debe ejecutarse de forma atómica (transacción con bloqueo o incremento a nivel de base de datos), para evitar condiciones de carrera cuando dos o más turistas generan un informe para la misma zona y fecha de forma simultánea.</w:t>
+        <w:t xml:space="preserve">El incremento del contador de aforo debe ejecutarse de forma atómica (transacción con bloqueo o incremento a nivel de base de datos), para evitar condiciones de carrera cuando dos </w:t>
+      </w:r>
+      <w:r>
+        <w:lastRenderedPageBreak/>
+        <w:t>o más turistas generan un informe para la misma zona y fecha de forma simultánea.</w:t>
       </w:r>
     </w:p>
     <w:p>
@@ -9868,7 +10542,6 @@
                 <w:sz w:val="18"/>
                 <w:szCs w:val="18"/>
               </w:rPr>
-              <w:lastRenderedPageBreak/>
               <w:t xml:space="preserve">El sistema excluye del listado de selección a las estaciones marcadas como inactivas </w:t>
             </w:r>
             <w:r>
@@ -10476,6 +11149,22 @@
           <w:lang w:val="es-ES"/>
         </w:rPr>
       </w:pPr>
+      <w:r>
+        <w:rPr>
+          <w:sz w:val="18"/>
+          <w:szCs w:val="18"/>
+          <w:lang w:val="es-ES"/>
+        </w:rPr>
+        <w:br/>
+      </w:r>
+      <w:r>
+        <w:rPr>
+          <w:sz w:val="18"/>
+          <w:szCs w:val="18"/>
+          <w:lang w:val="es-ES"/>
+        </w:rPr>
+        <w:br/>
+      </w:r>
     </w:p>
     <w:tbl>
       <w:tblPr>
@@ -10509,6 +11198,7 @@
                 <w:sz w:val="18"/>
                 <w:szCs w:val="18"/>
               </w:rPr>
+              <w:lastRenderedPageBreak/>
               <w:t xml:space="preserve">Número: </w:t>
             </w:r>
             <w:r>
@@ -10970,7 +11660,6 @@
                 <w:sz w:val="18"/>
                 <w:szCs w:val="18"/>
               </w:rPr>
-              <w:lastRenderedPageBreak/>
               <w:t xml:space="preserve">Descripción: </w:t>
             </w:r>
             <w:r>
@@ -11348,7 +12037,7 @@
               <w:tabs>
                 <w:tab w:val="left" w:pos="4500"/>
               </w:tabs>
-              <w:spacing w:after="100"/>
+              <w:spacing w:after="100" w:line="276" w:lineRule="auto"/>
               <w:rPr>
                 <w:sz w:val="18"/>
                 <w:szCs w:val="18"/>
@@ -11396,7 +12085,7 @@
           </w:p>
           <w:p>
             <w:pPr>
-              <w:spacing w:after="100"/>
+              <w:spacing w:after="100" w:line="276" w:lineRule="auto"/>
               <w:rPr>
                 <w:sz w:val="18"/>
                 <w:szCs w:val="18"/>
@@ -11424,7 +12113,7 @@
               <w:tabs>
                 <w:tab w:val="left" w:pos="4500"/>
               </w:tabs>
-              <w:spacing w:after="100"/>
+              <w:spacing w:after="100" w:line="276" w:lineRule="auto"/>
               <w:rPr>
                 <w:sz w:val="18"/>
                 <w:szCs w:val="18"/>
@@ -11472,7 +12161,7 @@
           </w:p>
           <w:p>
             <w:pPr>
-              <w:spacing w:after="100"/>
+              <w:spacing w:after="100" w:line="276" w:lineRule="auto"/>
               <w:rPr>
                 <w:sz w:val="18"/>
                 <w:szCs w:val="18"/>
@@ -11497,7 +12186,7 @@
           </w:p>
           <w:p>
             <w:pPr>
-              <w:spacing w:after="100"/>
+              <w:spacing w:after="100" w:line="276" w:lineRule="auto"/>
               <w:rPr>
                 <w:sz w:val="18"/>
                 <w:szCs w:val="18"/>
@@ -11522,7 +12211,7 @@
           </w:p>
           <w:p>
             <w:pPr>
-              <w:spacing w:after="100"/>
+              <w:spacing w:after="100" w:line="276" w:lineRule="auto"/>
               <w:jc w:val="both"/>
               <w:rPr>
                 <w:sz w:val="18"/>
@@ -11548,7 +12237,7 @@
           </w:p>
           <w:p>
             <w:pPr>
-              <w:spacing w:after="60"/>
+              <w:spacing w:after="60" w:line="276" w:lineRule="auto"/>
               <w:rPr>
                 <w:b/>
                 <w:bCs/>
@@ -11573,7 +12262,7 @@
                 <w:ilvl w:val="0"/>
                 <w:numId w:val="18"/>
               </w:numPr>
-              <w:spacing w:after="60"/>
+              <w:spacing w:after="60" w:line="276" w:lineRule="auto"/>
               <w:rPr>
                 <w:sz w:val="18"/>
                 <w:szCs w:val="18"/>
@@ -11584,6 +12273,7 @@
                 <w:sz w:val="18"/>
                 <w:szCs w:val="18"/>
               </w:rPr>
+              <w:lastRenderedPageBreak/>
               <w:t>El sistema solo aplica la validación de aforo en zonas que tengan configurado un cupo máximo diario.</w:t>
             </w:r>
           </w:p>
@@ -11594,7 +12284,7 @@
                 <w:ilvl w:val="0"/>
                 <w:numId w:val="18"/>
               </w:numPr>
-              <w:spacing w:after="60"/>
+              <w:spacing w:after="60" w:line="276" w:lineRule="auto"/>
               <w:rPr>
                 <w:sz w:val="18"/>
                 <w:szCs w:val="18"/>
@@ -11606,6 +12296,367 @@
                 <w:szCs w:val="18"/>
               </w:rPr>
               <w:t>Si el cupo de le fecha ya fue alcanzado, el sistema rechaza la generación del informe y sugiere una fecha alternativa.</w:t>
+            </w:r>
+          </w:p>
+        </w:tc>
+      </w:tr>
+    </w:tbl>
+    <w:p>
+      <w:pPr>
+        <w:rPr>
+          <w:sz w:val="18"/>
+          <w:szCs w:val="18"/>
+        </w:rPr>
+      </w:pPr>
+    </w:p>
+    <w:tbl>
+      <w:tblPr>
+        <w:tblStyle w:val="Tablaconcuadrcula"/>
+        <w:tblW w:w="0" w:type="auto"/>
+        <w:tblLook w:val="04A0" w:firstRow="1" w:lastRow="0" w:firstColumn="1" w:lastColumn="0" w:noHBand="0" w:noVBand="1"/>
+      </w:tblPr>
+      <w:tblGrid>
+        <w:gridCol w:w="8494"/>
+      </w:tblGrid>
+      <w:tr>
+        <w:tc>
+          <w:tcPr>
+            <w:tcW w:w="8494" w:type="dxa"/>
+          </w:tcPr>
+          <w:p>
+            <w:pPr>
+              <w:spacing w:line="360" w:lineRule="auto"/>
+              <w:ind w:left="4569" w:hanging="4569"/>
+              <w:rPr>
+                <w:sz w:val="18"/>
+                <w:szCs w:val="18"/>
+              </w:rPr>
+            </w:pPr>
+            <w:r>
+              <w:rPr>
+                <w:b/>
+                <w:bCs/>
+                <w:sz w:val="18"/>
+                <w:szCs w:val="18"/>
+              </w:rPr>
+              <w:t xml:space="preserve">Número: </w:t>
+            </w:r>
+            <w:r>
+              <w:rPr>
+                <w:sz w:val="18"/>
+                <w:szCs w:val="18"/>
+              </w:rPr>
+              <w:t>HURF08</w:t>
+            </w:r>
+            <w:r>
+              <w:rPr>
+                <w:sz w:val="18"/>
+                <w:szCs w:val="18"/>
+              </w:rPr>
+              <w:tab/>
+            </w:r>
+            <w:r>
+              <w:rPr>
+                <w:b/>
+                <w:bCs/>
+                <w:sz w:val="18"/>
+                <w:szCs w:val="18"/>
+              </w:rPr>
+              <w:t xml:space="preserve">Usuario: </w:t>
+            </w:r>
+            <w:r>
+              <w:rPr>
+                <w:sz w:val="18"/>
+                <w:szCs w:val="18"/>
+              </w:rPr>
+              <w:t>Turista (Usuario Final)</w:t>
+            </w:r>
+          </w:p>
+          <w:p>
+            <w:pPr>
+              <w:spacing w:line="360" w:lineRule="auto"/>
+              <w:rPr>
+                <w:b/>
+                <w:bCs/>
+                <w:sz w:val="18"/>
+                <w:szCs w:val="18"/>
+              </w:rPr>
+            </w:pPr>
+            <w:r>
+              <w:rPr>
+                <w:b/>
+                <w:bCs/>
+                <w:sz w:val="18"/>
+                <w:szCs w:val="18"/>
+              </w:rPr>
+              <w:t xml:space="preserve">Nombre </w:t>
+            </w:r>
+            <w:r>
+              <w:rPr>
+                <w:b/>
+                <w:bCs/>
+                <w:sz w:val="18"/>
+                <w:szCs w:val="18"/>
+              </w:rPr>
+              <w:t>Historia:</w:t>
+            </w:r>
+            <w:r>
+              <w:rPr>
+                <w:sz w:val="18"/>
+                <w:szCs w:val="18"/>
+              </w:rPr>
+              <w:t xml:space="preserve"> Consulta</w:t>
+            </w:r>
+            <w:r>
+              <w:rPr>
+                <w:sz w:val="18"/>
+                <w:szCs w:val="18"/>
+              </w:rPr>
+              <w:t xml:space="preserve"> de historial de informes de planificación</w:t>
+            </w:r>
+          </w:p>
+          <w:p>
+            <w:pPr>
+              <w:spacing w:line="360" w:lineRule="auto"/>
+              <w:rPr>
+                <w:b/>
+                <w:bCs/>
+                <w:sz w:val="18"/>
+                <w:szCs w:val="18"/>
+              </w:rPr>
+            </w:pPr>
+            <w:r>
+              <w:rPr>
+                <w:b/>
+                <w:bCs/>
+                <w:sz w:val="18"/>
+                <w:szCs w:val="18"/>
+              </w:rPr>
+              <w:t xml:space="preserve">Prioridad en </w:t>
+            </w:r>
+            <w:r>
+              <w:rPr>
+                <w:b/>
+                <w:bCs/>
+                <w:sz w:val="18"/>
+                <w:szCs w:val="18"/>
+              </w:rPr>
+              <w:t>Negocio:</w:t>
+            </w:r>
+            <w:r>
+              <w:rPr>
+                <w:sz w:val="18"/>
+                <w:szCs w:val="18"/>
+              </w:rPr>
+              <w:t xml:space="preserve"> Media</w:t>
+            </w:r>
+            <w:r>
+              <w:rPr>
+                <w:sz w:val="18"/>
+                <w:szCs w:val="18"/>
+              </w:rPr>
+              <w:tab/>
+            </w:r>
+            <w:r>
+              <w:rPr>
+                <w:sz w:val="18"/>
+                <w:szCs w:val="18"/>
+              </w:rPr>
+              <w:t xml:space="preserve">                                                            </w:t>
+            </w:r>
+            <w:r>
+              <w:rPr>
+                <w:b/>
+                <w:bCs/>
+                <w:sz w:val="18"/>
+                <w:szCs w:val="18"/>
+              </w:rPr>
+              <w:t>Requisitos:</w:t>
+            </w:r>
+            <w:r>
+              <w:rPr>
+                <w:sz w:val="18"/>
+                <w:szCs w:val="18"/>
+              </w:rPr>
+              <w:t xml:space="preserve"> HURF</w:t>
+            </w:r>
+            <w:r>
+              <w:rPr>
+                <w:sz w:val="18"/>
+                <w:szCs w:val="18"/>
+              </w:rPr>
+              <w:t>04, HURF05</w:t>
+            </w:r>
+          </w:p>
+          <w:p>
+            <w:pPr>
+              <w:spacing w:line="360" w:lineRule="auto"/>
+              <w:rPr>
+                <w:sz w:val="18"/>
+                <w:szCs w:val="18"/>
+              </w:rPr>
+            </w:pPr>
+            <w:r>
+              <w:rPr>
+                <w:b/>
+                <w:bCs/>
+                <w:sz w:val="18"/>
+                <w:szCs w:val="18"/>
+              </w:rPr>
+              <w:t>Iteración Asignada:</w:t>
+            </w:r>
+            <w:r>
+              <w:rPr>
+                <w:b/>
+                <w:bCs/>
+                <w:sz w:val="18"/>
+                <w:szCs w:val="18"/>
+              </w:rPr>
+              <w:t xml:space="preserve"> </w:t>
+            </w:r>
+            <w:r>
+              <w:rPr>
+                <w:sz w:val="18"/>
+                <w:szCs w:val="18"/>
+              </w:rPr>
+              <w:t>4</w:t>
+            </w:r>
+          </w:p>
+          <w:p>
+            <w:pPr>
+              <w:spacing w:line="360" w:lineRule="auto"/>
+              <w:rPr>
+                <w:b/>
+                <w:bCs/>
+                <w:sz w:val="18"/>
+                <w:szCs w:val="18"/>
+              </w:rPr>
+            </w:pPr>
+            <w:r>
+              <w:rPr>
+                <w:b/>
+                <w:bCs/>
+                <w:sz w:val="18"/>
+                <w:szCs w:val="18"/>
+              </w:rPr>
+              <w:t xml:space="preserve">Módulo </w:t>
+            </w:r>
+            <w:r>
+              <w:rPr>
+                <w:b/>
+                <w:bCs/>
+                <w:sz w:val="18"/>
+                <w:szCs w:val="18"/>
+              </w:rPr>
+              <w:t>Asignado:</w:t>
+            </w:r>
+            <w:r>
+              <w:rPr>
+                <w:sz w:val="18"/>
+                <w:szCs w:val="18"/>
+              </w:rPr>
+              <w:t xml:space="preserve"> Módulo</w:t>
+            </w:r>
+            <w:r>
+              <w:rPr>
+                <w:sz w:val="18"/>
+                <w:szCs w:val="18"/>
+              </w:rPr>
+              <w:t xml:space="preserve"> de Informes / Cliente</w:t>
+            </w:r>
+          </w:p>
+          <w:p>
+            <w:pPr>
+              <w:spacing w:line="276" w:lineRule="auto"/>
+              <w:rPr>
+                <w:sz w:val="18"/>
+                <w:szCs w:val="18"/>
+              </w:rPr>
+            </w:pPr>
+            <w:r>
+              <w:rPr>
+                <w:b/>
+                <w:bCs/>
+                <w:sz w:val="18"/>
+                <w:szCs w:val="18"/>
+              </w:rPr>
+              <w:t>Descripción:</w:t>
+            </w:r>
+            <w:r>
+              <w:rPr>
+                <w:sz w:val="18"/>
+                <w:szCs w:val="18"/>
+              </w:rPr>
+              <w:t xml:space="preserve"> Yo</w:t>
+            </w:r>
+            <w:r>
+              <w:rPr>
+                <w:sz w:val="18"/>
+                <w:szCs w:val="18"/>
+              </w:rPr>
+              <w:t xml:space="preserve"> como turista autenticado, quiero consultar el historial cronológico de todos los informes de planificación que he generado, para poder revisar mis rutas, fechas y costos estimados, y descargar nuevamente los comprobantes en PDF sin tener que volver a ingresar los criterios de búsqueda.</w:t>
+            </w:r>
+          </w:p>
+          <w:p>
+            <w:pPr>
+              <w:spacing w:line="360" w:lineRule="auto"/>
+              <w:rPr>
+                <w:b/>
+                <w:bCs/>
+                <w:sz w:val="18"/>
+                <w:szCs w:val="18"/>
+              </w:rPr>
+            </w:pPr>
+            <w:r>
+              <w:rPr>
+                <w:b/>
+                <w:bCs/>
+                <w:sz w:val="18"/>
+                <w:szCs w:val="18"/>
+              </w:rPr>
+              <w:t>Validación:</w:t>
+            </w:r>
+          </w:p>
+          <w:p>
+            <w:pPr>
+              <w:pStyle w:val="Prrafodelista"/>
+              <w:numPr>
+                <w:ilvl w:val="0"/>
+                <w:numId w:val="31"/>
+              </w:numPr>
+              <w:spacing w:line="276" w:lineRule="auto"/>
+              <w:rPr>
+                <w:sz w:val="18"/>
+                <w:szCs w:val="18"/>
+              </w:rPr>
+            </w:pPr>
+            <w:r>
+              <w:rPr>
+                <w:sz w:val="18"/>
+                <w:szCs w:val="18"/>
+              </w:rPr>
+              <w:t>El sistema restringe el acceso al historial únicamente a usuarios autenticados con rol TURISTA_PUBLICO o superior.</w:t>
+            </w:r>
+          </w:p>
+          <w:p>
+            <w:pPr>
+              <w:pStyle w:val="Prrafodelista"/>
+              <w:numPr>
+                <w:ilvl w:val="0"/>
+                <w:numId w:val="31"/>
+              </w:numPr>
+              <w:spacing w:line="276" w:lineRule="auto"/>
+              <w:rPr>
+                <w:sz w:val="18"/>
+                <w:szCs w:val="18"/>
+              </w:rPr>
+            </w:pPr>
+            <w:r>
+              <w:rPr>
+                <w:sz w:val="18"/>
+                <w:szCs w:val="18"/>
+              </w:rPr>
+              <w:t>El sistema muestra exclusivamente los informes generados por la cuenta del usuario en sesión, ordenados del más reciente al más antiguo, con opciones para ver HTML y descargar PDF.</w:t>
             </w:r>
           </w:p>
         </w:tc>
@@ -11928,7 +12979,21 @@
                 <w:sz w:val="18"/>
                 <w:szCs w:val="18"/>
               </w:rPr>
-              <w:t>Carol (Análisis) / Ab (Desarrollo)</w:t>
+              <w:t>Carol (Análisis) / A</w:t>
+            </w:r>
+            <w:r>
+              <w:rPr>
+                <w:sz w:val="18"/>
+                <w:szCs w:val="18"/>
+              </w:rPr>
+              <w:t>ndre</w:t>
+            </w:r>
+            <w:r>
+              <w:rPr>
+                <w:sz w:val="18"/>
+                <w:szCs w:val="18"/>
+              </w:rPr>
+              <w:t xml:space="preserve"> (Desarrollo)</w:t>
             </w:r>
           </w:p>
         </w:tc>
@@ -12068,7 +13133,21 @@
                 <w:sz w:val="18"/>
                 <w:szCs w:val="18"/>
               </w:rPr>
-              <w:t>Carol (Análisis) / Ab (Desarrollo)</w:t>
+              <w:t>Carol (Análisis) / A</w:t>
+            </w:r>
+            <w:r>
+              <w:rPr>
+                <w:sz w:val="18"/>
+                <w:szCs w:val="18"/>
+              </w:rPr>
+              <w:t>ndre</w:t>
+            </w:r>
+            <w:r>
+              <w:rPr>
+                <w:sz w:val="18"/>
+                <w:szCs w:val="18"/>
+              </w:rPr>
+              <w:t xml:space="preserve"> (Desarrollo)</w:t>
             </w:r>
           </w:p>
         </w:tc>
@@ -12208,7 +13287,21 @@
                 <w:sz w:val="18"/>
                 <w:szCs w:val="18"/>
               </w:rPr>
-              <w:t>Carol (Análisis) / Ab (Desarrollo)</w:t>
+              <w:t>Carol (Análisis) / A</w:t>
+            </w:r>
+            <w:r>
+              <w:rPr>
+                <w:sz w:val="18"/>
+                <w:szCs w:val="18"/>
+              </w:rPr>
+              <w:t>ndre</w:t>
+            </w:r>
+            <w:r>
+              <w:rPr>
+                <w:sz w:val="18"/>
+                <w:szCs w:val="18"/>
+              </w:rPr>
+              <w:t xml:space="preserve"> (Desarrollo)</w:t>
             </w:r>
           </w:p>
         </w:tc>
@@ -12348,7 +13441,28 @@
                 <w:sz w:val="18"/>
                 <w:szCs w:val="18"/>
               </w:rPr>
-              <w:t>André (Arquitectura) / Ab (Desarrollo)</w:t>
+              <w:t>Renzo</w:t>
+            </w:r>
+            <w:r>
+              <w:rPr>
+                <w:sz w:val="18"/>
+                <w:szCs w:val="18"/>
+              </w:rPr>
+              <w:t xml:space="preserve"> (Arquitectura) / A</w:t>
+            </w:r>
+            <w:r>
+              <w:rPr>
+                <w:sz w:val="18"/>
+                <w:szCs w:val="18"/>
+              </w:rPr>
+              <w:t>ndre</w:t>
+            </w:r>
+            <w:r>
+              <w:rPr>
+                <w:sz w:val="18"/>
+                <w:szCs w:val="18"/>
+              </w:rPr>
+              <w:t xml:space="preserve"> (Desarrollo)</w:t>
             </w:r>
           </w:p>
         </w:tc>
@@ -12396,15 +13510,7 @@
                 <w:sz w:val="18"/>
                 <w:szCs w:val="18"/>
               </w:rPr>
-              <w:t xml:space="preserve">Generación de informe </w:t>
-            </w:r>
-            <w:r>
-              <w:rPr>
-                <w:sz w:val="18"/>
-                <w:szCs w:val="18"/>
-              </w:rPr>
-              <w:lastRenderedPageBreak/>
-              <w:t>consolidado de visita</w:t>
+              <w:t>Generación de informe consolidado de visita</w:t>
             </w:r>
           </w:p>
         </w:tc>
@@ -12427,7 +13533,6 @@
                 <w:sz w:val="18"/>
                 <w:szCs w:val="18"/>
               </w:rPr>
-              <w:lastRenderedPageBreak/>
               <w:t>Alta</w:t>
             </w:r>
           </w:p>
@@ -12497,7 +13602,21 @@
                 <w:sz w:val="18"/>
                 <w:szCs w:val="18"/>
               </w:rPr>
-              <w:t>Ab (Desarrollo)</w:t>
+              <w:t>A</w:t>
+            </w:r>
+            <w:r>
+              <w:rPr>
+                <w:sz w:val="18"/>
+                <w:szCs w:val="18"/>
+              </w:rPr>
+              <w:t>ndre</w:t>
+            </w:r>
+            <w:r>
+              <w:rPr>
+                <w:sz w:val="18"/>
+                <w:szCs w:val="18"/>
+              </w:rPr>
+              <w:t xml:space="preserve"> (Desarrollo)</w:t>
             </w:r>
           </w:p>
         </w:tc>
@@ -12637,7 +13756,28 @@
                 <w:sz w:val="18"/>
                 <w:szCs w:val="18"/>
               </w:rPr>
-              <w:t>André (Arquitectura) / Ab (Desarrollo)</w:t>
+              <w:t>Renzo</w:t>
+            </w:r>
+            <w:r>
+              <w:rPr>
+                <w:sz w:val="18"/>
+                <w:szCs w:val="18"/>
+              </w:rPr>
+              <w:t xml:space="preserve"> (Arquitectura) / A</w:t>
+            </w:r>
+            <w:r>
+              <w:rPr>
+                <w:sz w:val="18"/>
+                <w:szCs w:val="18"/>
+              </w:rPr>
+              <w:t>ndre</w:t>
+            </w:r>
+            <w:r>
+              <w:rPr>
+                <w:sz w:val="18"/>
+                <w:szCs w:val="18"/>
+              </w:rPr>
+              <w:t xml:space="preserve"> (Desarrollo)</w:t>
             </w:r>
           </w:p>
         </w:tc>
@@ -12777,20 +13917,180 @@
                 <w:sz w:val="18"/>
                 <w:szCs w:val="18"/>
               </w:rPr>
-              <w:t>Carol (Análisis) / Ab (Desarrollo)</w:t>
+              <w:t>Carol (Análisis) / A</w:t>
+            </w:r>
+            <w:r>
+              <w:rPr>
+                <w:sz w:val="18"/>
+                <w:szCs w:val="18"/>
+              </w:rPr>
+              <w:t>ndre</w:t>
+            </w:r>
+            <w:r>
+              <w:rPr>
+                <w:sz w:val="18"/>
+                <w:szCs w:val="18"/>
+              </w:rPr>
+              <w:t xml:space="preserve"> (Desarrollo)</w:t>
+            </w:r>
+          </w:p>
+        </w:tc>
+      </w:tr>
+      <w:tr>
+        <w:tc>
+          <w:tcPr>
+            <w:tcW w:w="1415" w:type="dxa"/>
+            <w:vAlign w:val="center"/>
+          </w:tcPr>
+          <w:p>
+            <w:pPr>
+              <w:rPr>
+                <w:b/>
+                <w:bCs/>
+                <w:sz w:val="18"/>
+                <w:szCs w:val="18"/>
+              </w:rPr>
+            </w:pPr>
+            <w:r>
+              <w:rPr>
+                <w:sz w:val="18"/>
+                <w:szCs w:val="18"/>
+              </w:rPr>
+              <w:t>H08</w:t>
+            </w:r>
+          </w:p>
+        </w:tc>
+        <w:tc>
+          <w:tcPr>
+            <w:tcW w:w="1415" w:type="dxa"/>
+            <w:vAlign w:val="center"/>
+          </w:tcPr>
+          <w:p>
+            <w:pPr>
+              <w:rPr>
+                <w:b/>
+                <w:bCs/>
+                <w:sz w:val="18"/>
+                <w:szCs w:val="18"/>
+              </w:rPr>
+            </w:pPr>
+            <w:r>
+              <w:rPr>
+                <w:sz w:val="18"/>
+                <w:szCs w:val="18"/>
+              </w:rPr>
+              <w:t>Consulta de historial de informes de planificación</w:t>
+            </w:r>
+          </w:p>
+        </w:tc>
+        <w:tc>
+          <w:tcPr>
+            <w:tcW w:w="1416" w:type="dxa"/>
+            <w:vAlign w:val="center"/>
+          </w:tcPr>
+          <w:p>
+            <w:pPr>
+              <w:rPr>
+                <w:b/>
+                <w:bCs/>
+                <w:sz w:val="18"/>
+                <w:szCs w:val="18"/>
+              </w:rPr>
+            </w:pPr>
+            <w:r>
+              <w:rPr>
+                <w:sz w:val="18"/>
+                <w:szCs w:val="18"/>
+              </w:rPr>
+              <w:t>Media</w:t>
+            </w:r>
+          </w:p>
+        </w:tc>
+        <w:tc>
+          <w:tcPr>
+            <w:tcW w:w="1416" w:type="dxa"/>
+            <w:vAlign w:val="center"/>
+          </w:tcPr>
+          <w:p>
+            <w:pPr>
+              <w:rPr>
+                <w:b/>
+                <w:bCs/>
+                <w:sz w:val="18"/>
+                <w:szCs w:val="18"/>
+              </w:rPr>
+            </w:pPr>
+            <w:r>
+              <w:rPr>
+                <w:sz w:val="18"/>
+                <w:szCs w:val="18"/>
+              </w:rPr>
+              <w:t>2</w:t>
+            </w:r>
+          </w:p>
+        </w:tc>
+        <w:tc>
+          <w:tcPr>
+            <w:tcW w:w="1416" w:type="dxa"/>
+            <w:vAlign w:val="center"/>
+          </w:tcPr>
+          <w:p>
+            <w:pPr>
+              <w:rPr>
+                <w:b/>
+                <w:bCs/>
+                <w:sz w:val="18"/>
+                <w:szCs w:val="18"/>
+              </w:rPr>
+            </w:pPr>
+            <w:r>
+              <w:rPr>
+                <w:sz w:val="18"/>
+                <w:szCs w:val="18"/>
+              </w:rPr>
+              <w:t>6</w:t>
+            </w:r>
+          </w:p>
+        </w:tc>
+        <w:tc>
+          <w:tcPr>
+            <w:tcW w:w="1416" w:type="dxa"/>
+            <w:vAlign w:val="center"/>
+          </w:tcPr>
+          <w:p>
+            <w:pPr>
+              <w:rPr>
+                <w:b/>
+                <w:bCs/>
+                <w:sz w:val="18"/>
+                <w:szCs w:val="18"/>
+              </w:rPr>
+            </w:pPr>
+            <w:r>
+              <w:rPr>
+                <w:sz w:val="18"/>
+                <w:szCs w:val="18"/>
+              </w:rPr>
+              <w:t>Carol (Análisis) / A</w:t>
+            </w:r>
+            <w:r>
+              <w:rPr>
+                <w:sz w:val="18"/>
+                <w:szCs w:val="18"/>
+              </w:rPr>
+              <w:t>ndre</w:t>
+            </w:r>
+            <w:r>
+              <w:rPr>
+                <w:sz w:val="18"/>
+                <w:szCs w:val="18"/>
+              </w:rPr>
+              <w:t xml:space="preserve"> (Desarrollo)</w:t>
             </w:r>
           </w:p>
         </w:tc>
       </w:tr>
     </w:tbl>
-    <w:p>
-      <w:pPr>
-        <w:rPr>
-          <w:b/>
-          <w:bCs/>
-        </w:rPr>
-      </w:pPr>
-    </w:p>
     <w:p>
       <w:pPr>
         <w:spacing w:line="278" w:lineRule="auto"/>
@@ -13396,43 +14696,7 @@
                 <w:szCs w:val="18"/>
                 <w:lang w:val="en-US"/>
               </w:rPr>
-              <w:t xml:space="preserve">Spring Scheduler (@Scheduled) — </w:t>
-            </w:r>
-            <w:proofErr w:type="spellStart"/>
-            <w:r>
-              <w:rPr>
-                <w:sz w:val="18"/>
-                <w:szCs w:val="18"/>
-                <w:lang w:val="en-US"/>
-              </w:rPr>
-              <w:t>sincronización</w:t>
-            </w:r>
-            <w:proofErr w:type="spellEnd"/>
-            <w:r>
-              <w:rPr>
-                <w:sz w:val="18"/>
-                <w:szCs w:val="18"/>
-                <w:lang w:val="en-US"/>
-              </w:rPr>
-              <w:t xml:space="preserve"> </w:t>
-            </w:r>
-            <w:proofErr w:type="spellStart"/>
-            <w:r>
-              <w:rPr>
-                <w:sz w:val="18"/>
-                <w:szCs w:val="18"/>
-                <w:lang w:val="en-US"/>
-              </w:rPr>
-              <w:t>PeruRail</w:t>
-            </w:r>
-            <w:proofErr w:type="spellEnd"/>
-            <w:r>
-              <w:rPr>
-                <w:sz w:val="18"/>
-                <w:szCs w:val="18"/>
-                <w:lang w:val="en-US"/>
-              </w:rPr>
-              <w:t xml:space="preserve"> y SENAMHI</w:t>
+              <w:t>Spring Scheduler (@Scheduled) — sincronización PeruRail y SENAMHI</w:t>
             </w:r>
           </w:p>
         </w:tc>
@@ -13459,23 +14723,7 @@
                 <w:sz w:val="18"/>
                 <w:szCs w:val="18"/>
               </w:rPr>
-              <w:t xml:space="preserve">Consumo de </w:t>
-            </w:r>
-            <w:proofErr w:type="spellStart"/>
-            <w:r>
-              <w:rPr>
-                <w:sz w:val="18"/>
-                <w:szCs w:val="18"/>
-              </w:rPr>
-              <w:t>APIs</w:t>
-            </w:r>
-            <w:proofErr w:type="spellEnd"/>
-            <w:r>
-              <w:rPr>
-                <w:sz w:val="18"/>
-                <w:szCs w:val="18"/>
-              </w:rPr>
-              <w:t xml:space="preserve"> externas</w:t>
+              <w:t>Consumo de APIs externas</w:t>
             </w:r>
           </w:p>
         </w:tc>
@@ -13496,23 +14744,13 @@
                 <w:lang w:val="en-US"/>
               </w:rPr>
             </w:pPr>
-            <w:proofErr w:type="spellStart"/>
             <w:r>
               <w:rPr>
                 <w:sz w:val="18"/>
                 <w:szCs w:val="18"/>
                 <w:lang w:val="en-US"/>
               </w:rPr>
-              <w:t>RestClient</w:t>
-            </w:r>
-            <w:proofErr w:type="spellEnd"/>
-            <w:r>
-              <w:rPr>
-                <w:sz w:val="18"/>
-                <w:szCs w:val="18"/>
-                <w:lang w:val="en-US"/>
-              </w:rPr>
-              <w:t xml:space="preserve"> / HTTP Service Clients (@HttpExchange)</w:t>
+              <w:t>RestClient / HTTP Service Clients (@HttpExchange)</w:t>
             </w:r>
           </w:p>
         </w:tc>
@@ -13812,10 +15050,10 @@
           <w:noProof/>
         </w:rPr>
         <w:drawing>
-          <wp:inline distT="0" distB="0" distL="0" distR="0" wp14:anchorId="101D0DA4" wp14:editId="03CA1584">
-            <wp:extent cx="3834365" cy="2690446"/>
-            <wp:effectExtent l="0" t="0" r="0" b="0"/>
-            <wp:docPr id="361829305" name="Imagen 361829305"/>
+          <wp:inline distT="0" distB="0" distL="0" distR="0" wp14:anchorId="6162D5A3" wp14:editId="7520F7F2">
+            <wp:extent cx="5398770" cy="2737485"/>
+            <wp:effectExtent l="0" t="0" r="0" b="5715"/>
+            <wp:docPr id="65697501" name="Imagen 1"/>
             <wp:cNvGraphicFramePr>
               <a:graphicFrameLocks xmlns:a="http://schemas.openxmlformats.org/drawingml/2006/main" noChangeAspect="1"/>
             </wp:cNvGraphicFramePr>
@@ -13823,13 +15061,19 @@
               <a:graphicData uri="http://schemas.openxmlformats.org/drawingml/2006/picture">
                 <pic:pic xmlns:pic="http://schemas.openxmlformats.org/drawingml/2006/picture">
                   <pic:nvPicPr>
-                    <pic:cNvPr id="0" name=""/>
+                    <pic:cNvPr id="0" name="Picture 1"/>
                     <pic:cNvPicPr>
                       <a:picLocks noChangeAspect="1" noChangeArrowheads="1"/>
                     </pic:cNvPicPr>
                   </pic:nvPicPr>
                   <pic:blipFill>
-                    <a:blip r:embed="rId12"/>
+                    <a:blip r:embed="rId12" cstate="print">
+                      <a:extLst>
+                        <a:ext uri="{28A0092B-C50C-407E-A947-70E740481C1C}">
+                          <a14:useLocalDpi xmlns:a14="http://schemas.microsoft.com/office/drawing/2010/main" val="0"/>
+                        </a:ext>
+                      </a:extLst>
+                    </a:blip>
                     <a:srcRect/>
                     <a:stretch>
                       <a:fillRect/>
@@ -13838,11 +15082,15 @@
                   <pic:spPr bwMode="auto">
                     <a:xfrm>
                       <a:off x="0" y="0"/>
-                      <a:ext cx="3861543" cy="2709516"/>
+                      <a:ext cx="5398770" cy="2737485"/>
                     </a:xfrm>
                     <a:prstGeom prst="rect">
                       <a:avLst/>
                     </a:prstGeom>
+                    <a:noFill/>
+                    <a:ln>
+                      <a:noFill/>
+                    </a:ln>
                   </pic:spPr>
                 </pic:pic>
               </a:graphicData>
@@ -13860,27 +15108,14 @@
       <w:r>
         <w:t xml:space="preserve">Figura </w:t>
       </w:r>
-      <w:r>
-        <w:fldChar w:fldCharType="begin"/>
-      </w:r>
-      <w:r>
-        <w:instrText xml:space="preserve"> SEQ Figura \* ARABIC </w:instrText>
-      </w:r>
-      <w:r>
-        <w:fldChar w:fldCharType="separate"/>
-      </w:r>
-      <w:r>
-        <w:rPr>
-          <w:noProof/>
-        </w:rPr>
-        <w:t>2</w:t>
-      </w:r>
-      <w:r>
-        <w:rPr>
-          <w:noProof/>
-        </w:rPr>
-        <w:fldChar w:fldCharType="end"/>
-      </w:r>
+      <w:fldSimple w:instr=" SEQ Figura \* ARABIC ">
+        <w:r>
+          <w:rPr>
+            <w:noProof/>
+          </w:rPr>
+          <w:t>2</w:t>
+        </w:r>
+      </w:fldSimple>
       <w:r>
         <w:t>. Arquitectura lógica del sistema</w:t>
       </w:r>
@@ -13892,7 +15127,31 @@
         <w:jc w:val="both"/>
       </w:pPr>
       <w:r>
-        <w:t>Los requerimientos RF-01 a RF-03 son atendidos principalmente por las capas de Presentación y Negocio; los RF-04 a RF-08 requieren la orquestación conjunta de las capas de Negocio, Integración de APIs y Persistencia; los RF-13 a RF-15 dependen directamente de la Capa de Integración de APIs y de los mecanismos de auditoría de la Capa de Persistencia; y los RF-16 y RF-17 (control de aforo) son resueltos por AforoService en la Capa de Negocio, apoyado en la Capa de Persistencia para la lectura y actualización atómica del contador de cupos.</w:t>
+        <w:t>Los requerimientos RF-01 a RF-03 son atendidos principalmente por las capas de Presentación y Negocio; los RF-04 a RF-08 requieren la orquestación conjunta de las capas de Negocio, Integración de APIs y Persistencia; los RF-1</w:t>
+      </w:r>
+      <w:r>
+        <w:t>4</w:t>
+      </w:r>
+      <w:r>
+        <w:t xml:space="preserve"> a RF-1</w:t>
+      </w:r>
+      <w:r>
+        <w:t>6</w:t>
+      </w:r>
+      <w:r>
+        <w:t xml:space="preserve"> dependen directamente de la Capa de Integración de APIs y de los mecanismos de auditoría de la Capa de Persistencia; y los RF-1</w:t>
+      </w:r>
+      <w:r>
+        <w:t>7</w:t>
+      </w:r>
+      <w:r>
+        <w:t xml:space="preserve"> y RF-1</w:t>
+      </w:r>
+      <w:r>
+        <w:t>8</w:t>
+      </w:r>
+      <w:r>
+        <w:t xml:space="preserve"> (control de aforo) son resueltos por AforoService en la Capa de Negocio, apoyado en la Capa de Persistencia para la lectura y actualización atómica del contador de cupos.</w:t>
       </w:r>
     </w:p>
     <w:p>
@@ -13930,33 +15189,8 @@
         <w:t xml:space="preserve"> </w:t>
       </w:r>
       <w:r>
-        <w:t xml:space="preserve">La Capa de Presentación incorpora Leaflet.js junto con el motor peatonal OSRM (Open </w:t>
+        <w:t>La Capa de Presentación incorpora Leaflet.js junto con el motor peatonal OSRM (Open Source Routing Machine) sobre OpenStreetMap, para trazar la ruta interactiva siguiendo las calles y esquinas reales entre la estación y la zona turística. En caso de corte de conexión o fallo de red, cuenta con un mecanismo de respaldo (</w:t>
       </w:r>
-      <w:proofErr w:type="spellStart"/>
-      <w:r>
-        <w:t>Source</w:t>
-      </w:r>
-      <w:proofErr w:type="spellEnd"/>
-      <w:r>
-        <w:t xml:space="preserve"> </w:t>
-      </w:r>
-      <w:proofErr w:type="spellStart"/>
-      <w:r>
-        <w:t>Routing</w:t>
-      </w:r>
-      <w:proofErr w:type="spellEnd"/>
-      <w:r>
-        <w:t xml:space="preserve"> Machine) sobre </w:t>
-      </w:r>
-      <w:proofErr w:type="spellStart"/>
-      <w:r>
-        <w:t>OpenStreetMap</w:t>
-      </w:r>
-      <w:proofErr w:type="spellEnd"/>
-      <w:r>
-        <w:t>, para trazar la ruta interactiva siguiendo las calles y esquinas reales entre la estación y la zona turística. En caso de corte de conexión o fallo de red, cuenta con un mecanismo de respaldo (</w:t>
-      </w:r>
-      <w:proofErr w:type="spellStart"/>
       <w:r>
         <w:rPr>
           <w:i/>
@@ -13964,17 +15198,8 @@
         </w:rPr>
         <w:t>fallback</w:t>
       </w:r>
-      <w:proofErr w:type="spellEnd"/>
       <w:r>
-        <w:t>) que dibuja automáticamente el trazo en línea recta (</w:t>
-      </w:r>
-      <w:proofErr w:type="spellStart"/>
-      <w:r>
-        <w:t>Haversine</w:t>
-      </w:r>
-      <w:proofErr w:type="spellEnd"/>
-      <w:r>
-        <w:t>), garantizando que el mapa nunca quede vacío.</w:t>
+        <w:t>) que dibuja automáticamente el trazo en línea recta (Haversine), garantizando que el mapa nunca quede vacío.</w:t>
       </w:r>
     </w:p>
     <w:p>
@@ -13996,31 +15221,7 @@
         <w:t xml:space="preserve"> </w:t>
       </w:r>
       <w:r>
-        <w:t xml:space="preserve">En el </w:t>
-      </w:r>
-      <w:proofErr w:type="spellStart"/>
-      <w:r>
-        <w:t>backend</w:t>
-      </w:r>
-      <w:proofErr w:type="spellEnd"/>
-      <w:r>
-        <w:t>, </w:t>
-      </w:r>
-      <w:proofErr w:type="spellStart"/>
-      <w:r>
-        <w:t>RutaPeatonalService</w:t>
-      </w:r>
-      <w:proofErr w:type="spellEnd"/>
-      <w:r>
-        <w:t xml:space="preserve"> calcula la distancia base entre la estación y la zona turística mediante la fórmula de </w:t>
-      </w:r>
-      <w:proofErr w:type="spellStart"/>
-      <w:r>
-        <w:t>Haversine</w:t>
-      </w:r>
-      <w:proofErr w:type="spellEnd"/>
-      <w:r>
-        <w:t xml:space="preserve">, multiplicada por dos para el circuito cerrado de ida y vuelta. A partir de este cálculo se determina el tiempo estimado y el nivel de dificultad según la tabla paramétrica dificultad (RNF-06). Mantener este cálculo en el </w:t>
+        <w:t xml:space="preserve">En el backend, RutaPeatonalService calcula la distancia base entre la estación y la zona turística mediante la fórmula de Haversine, multiplicada por dos para el circuito cerrado de ida y vuelta. A partir de este cálculo se determina el tiempo estimado y el nivel de dificultad según la tabla paramétrica dificultad (RNF-06). Mantener este cálculo en el </w:t>
       </w:r>
       <w:r>
         <w:lastRenderedPageBreak/>
@@ -14224,27 +15425,14 @@
       <w:r>
         <w:t xml:space="preserve">Figura </w:t>
       </w:r>
-      <w:r>
-        <w:fldChar w:fldCharType="begin"/>
-      </w:r>
-      <w:r>
-        <w:instrText xml:space="preserve"> SEQ Figura \* ARABIC </w:instrText>
-      </w:r>
-      <w:r>
-        <w:fldChar w:fldCharType="separate"/>
-      </w:r>
-      <w:r>
-        <w:rPr>
-          <w:noProof/>
-        </w:rPr>
-        <w:t>3</w:t>
-      </w:r>
-      <w:r>
-        <w:rPr>
-          <w:noProof/>
-        </w:rPr>
-        <w:fldChar w:fldCharType="end"/>
-      </w:r>
+      <w:fldSimple w:instr=" SEQ Figura \* ARABIC ">
+        <w:r>
+          <w:rPr>
+            <w:noProof/>
+          </w:rPr>
+          <w:t>3</w:t>
+        </w:r>
+      </w:fldSimple>
       <w:r>
         <w:t>. Arquitectura física – Topología de despliegue</w:t>
       </w:r>
@@ -14346,18 +15534,16 @@
       <w:pPr>
         <w:spacing w:after="200"/>
         <w:ind w:left="708"/>
-        <w:jc w:val="center"/>
       </w:pPr>
       <w:r>
         <w:rPr>
           <w:noProof/>
         </w:rPr>
-        <w:lastRenderedPageBreak/>
         <w:drawing>
-          <wp:inline distT="0" distB="0" distL="0" distR="0" wp14:anchorId="274D8BBC" wp14:editId="4E6CCDE3">
-            <wp:extent cx="5943600" cy="3661410"/>
+          <wp:inline distT="0" distB="0" distL="0" distR="0" wp14:anchorId="25FB308E" wp14:editId="2C72986A">
+            <wp:extent cx="5398770" cy="2614295"/>
             <wp:effectExtent l="0" t="0" r="0" b="0"/>
-            <wp:docPr id="1988492124" name="Imagen 2"/>
+            <wp:docPr id="1465879657" name="Imagen 1"/>
             <wp:cNvGraphicFramePr>
               <a:graphicFrameLocks xmlns:a="http://schemas.openxmlformats.org/drawingml/2006/main" noChangeAspect="1"/>
             </wp:cNvGraphicFramePr>
@@ -14365,7 +15551,7 @@
               <a:graphicData uri="http://schemas.openxmlformats.org/drawingml/2006/picture">
                 <pic:pic xmlns:pic="http://schemas.openxmlformats.org/drawingml/2006/picture">
                   <pic:nvPicPr>
-                    <pic:cNvPr id="0" name="Picture 2"/>
+                    <pic:cNvPr id="0" name="Picture 1"/>
                     <pic:cNvPicPr>
                       <a:picLocks noChangeAspect="1" noChangeArrowheads="1"/>
                     </pic:cNvPicPr>
@@ -14386,7 +15572,7 @@
                   <pic:spPr bwMode="auto">
                     <a:xfrm>
                       <a:off x="0" y="0"/>
-                      <a:ext cx="5965758" cy="3675060"/>
+                      <a:ext cx="5398770" cy="2614295"/>
                     </a:xfrm>
                     <a:prstGeom prst="rect">
                       <a:avLst/>
@@ -14435,7 +15621,11 @@
         <w:jc w:val="both"/>
       </w:pPr>
       <w:r>
-        <w:t>A partir del MER, el diseño lógico normaliza las entidades hasta la Tercera Forma Normal (3FN), evitando redundancias y dependencias transitivas. Cada entidad se traduce en una relación (tabla) con una llave primaria simple de tipo entero autogenerado, y las asociaciones N:1 identificadas en el MER se materializan como llaves foráneas. La siguiente tabla resume las relaciones lógicas resultantes:</w:t>
+        <w:t xml:space="preserve">A partir del MER, el diseño lógico normaliza las entidades hasta la Tercera Forma Normal (3FN), evitando redundancias y dependencias transitivas. Cada entidad se traduce en </w:t>
+      </w:r>
+      <w:r>
+        <w:lastRenderedPageBreak/>
+        <w:t>una relación (tabla) con una llave primaria simple de tipo entero autogenerado, y las asociaciones N:1 identificadas en el MER se materializan como llaves foráneas. La siguiente tabla resume las relaciones lógicas resultantes:</w:t>
       </w:r>
     </w:p>
     <w:p>
@@ -15507,15 +16697,7 @@
                 <w:sz w:val="18"/>
                 <w:szCs w:val="18"/>
               </w:rPr>
-              <w:t xml:space="preserve">IviIdInforme → InformePlanificacion · IviIdCategoriaTren → </w:t>
-            </w:r>
-            <w:r>
-              <w:rPr>
-                <w:sz w:val="18"/>
-                <w:szCs w:val="18"/>
-              </w:rPr>
-              <w:lastRenderedPageBreak/>
-              <w:t>CategoriaVisitante (opcional) · IviIdCategoriaZona → CategoriaVisitante</w:t>
+              <w:t>IviIdInforme → InformePlanificacion · IviIdCategoriaTren → CategoriaVisitante (opcional) · IviIdCategoriaZona → CategoriaVisitante</w:t>
             </w:r>
           </w:p>
         </w:tc>
@@ -15538,7 +16720,6 @@
                 <w:sz w:val="18"/>
                 <w:szCs w:val="18"/>
               </w:rPr>
-              <w:lastRenderedPageBreak/>
               <w:t>AuditoriaLog</w:t>
             </w:r>
           </w:p>
@@ -15594,6 +16775,7 @@
     </w:p>
     <w:p>
       <w:r>
+        <w:lastRenderedPageBreak/>
         <w:tab/>
       </w:r>
       <w:r>
@@ -15601,10 +16783,10 @@
           <w:noProof/>
         </w:rPr>
         <w:drawing>
-          <wp:inline distT="0" distB="0" distL="0" distR="0" wp14:anchorId="770BDF77" wp14:editId="5B05F21F">
-            <wp:extent cx="5399405" cy="3771900"/>
+          <wp:inline distT="0" distB="0" distL="0" distR="0" wp14:anchorId="43698595" wp14:editId="08F9E05D">
+            <wp:extent cx="5396230" cy="3638550"/>
             <wp:effectExtent l="0" t="0" r="0" b="0"/>
-            <wp:docPr id="451769587" name="Imagen 1"/>
+            <wp:docPr id="985067748" name="Imagen 1"/>
             <wp:cNvGraphicFramePr>
               <a:graphicFrameLocks xmlns:a="http://schemas.openxmlformats.org/drawingml/2006/main" noChangeAspect="1"/>
             </wp:cNvGraphicFramePr>
@@ -15633,7 +16815,7 @@
                   <pic:spPr bwMode="auto">
                     <a:xfrm>
                       <a:off x="0" y="0"/>
-                      <a:ext cx="5399405" cy="3771900"/>
+                      <a:ext cx="5396230" cy="3638550"/>
                     </a:xfrm>
                     <a:prstGeom prst="rect">
                       <a:avLst/>
@@ -15755,11 +16937,7 @@
         <w:t>Estación de origen propia en RutaPeatonal:</w:t>
       </w:r>
       <w:r>
-        <w:t xml:space="preserve"> RutIdEstacionOrigen es una llave foránea directa hacia Estacion, en vez de resolverse mediante ZonaTuristica.ZonIdEstacionCercana. Los campos RutDistanciaKm, RutTiempoEstimadoMin y RutIdDificultad son el resultado de un cálculo (Haversine) hecho en un momento específico con una estación de origen específica (RutaPeatonalService, sección 5.1); si la estación más cercana de la zona cambiara más adelante, una ruta ya calculada no debe cambiar de origen </w:t>
-      </w:r>
-      <w:r>
-        <w:lastRenderedPageBreak/>
-        <w:t>automáticamente vía JOIN, o sus valores de distancia y tiempo quedarían inconsistentes con la estación realmente usada al calcularlos.</w:t>
+        <w:t xml:space="preserve"> RutIdEstacionOrigen es una llave foránea directa hacia Estacion, en vez de resolverse mediante ZonaTuristica.ZonIdEstacionCercana. Los campos RutDistanciaKm, RutTiempoEstimadoMin y RutIdDificultad son el resultado de un cálculo (Haversine) hecho en un momento específico con una estación de origen específica (RutaPeatonalService, sección 5.1); si la estación más cercana de la zona cambiara más adelante, una ruta ya calculada no debe cambiar de origen automáticamente vía JOIN, o sus valores de distancia y tiempo quedarían inconsistentes con la estación realmente usada al calcularlos.</w:t>
       </w:r>
     </w:p>
     <w:p>
@@ -15798,6 +16976,7 @@
           <w:b/>
           <w:bCs/>
         </w:rPr>
+        <w:lastRenderedPageBreak/>
         <w:t>Restricciones UNIQUE:</w:t>
       </w:r>
       <w:r>
@@ -15892,10 +17071,10 @@
         </w:rPr>
         <w:lastRenderedPageBreak/>
         <w:drawing>
-          <wp:inline distT="0" distB="0" distL="0" distR="0" wp14:anchorId="4351EC95" wp14:editId="7E476AEF">
-            <wp:extent cx="5400040" cy="5892165"/>
-            <wp:effectExtent l="0" t="0" r="0" b="0"/>
-            <wp:docPr id="886410238" name="Imagen 1"/>
+          <wp:inline distT="0" distB="0" distL="0" distR="0" wp14:anchorId="1596B980" wp14:editId="2132945E">
+            <wp:extent cx="5400040" cy="5229225"/>
+            <wp:effectExtent l="0" t="0" r="0" b="9525"/>
+            <wp:docPr id="1505618520" name="Imagen 1"/>
             <wp:cNvGraphicFramePr>
               <a:graphicFrameLocks xmlns:a="http://schemas.openxmlformats.org/drawingml/2006/main" noChangeAspect="1"/>
             </wp:cNvGraphicFramePr>
@@ -15903,7 +17082,7 @@
               <a:graphicData uri="http://schemas.openxmlformats.org/drawingml/2006/picture">
                 <pic:pic xmlns:pic="http://schemas.openxmlformats.org/drawingml/2006/picture">
                   <pic:nvPicPr>
-                    <pic:cNvPr id="886410238" name=""/>
+                    <pic:cNvPr id="1505618520" name=""/>
                     <pic:cNvPicPr/>
                   </pic:nvPicPr>
                   <pic:blipFill>
@@ -15915,7 +17094,7 @@
                   <pic:spPr>
                     <a:xfrm>
                       <a:off x="0" y="0"/>
-                      <a:ext cx="5400040" cy="5892165"/>
+                      <a:ext cx="5400040" cy="5229225"/>
                     </a:xfrm>
                     <a:prstGeom prst="rect">
                       <a:avLst/>
@@ -16496,7 +17675,6 @@
           <w:b/>
           <w:bCs/>
         </w:rPr>
-        <w:lastRenderedPageBreak/>
         <w:br/>
         <w:t>usuario</w:t>
       </w:r>
@@ -16551,6 +17729,7 @@
                 <w:sz w:val="17"/>
                 <w:szCs w:val="17"/>
               </w:rPr>
+              <w:lastRenderedPageBreak/>
               <w:t>Campo</w:t>
             </w:r>
           </w:p>
@@ -19049,7 +20228,6 @@
                 <w:sz w:val="17"/>
                 <w:szCs w:val="17"/>
               </w:rPr>
-              <w:lastRenderedPageBreak/>
               <w:t>DifOrden</w:t>
             </w:r>
           </w:p>
@@ -19183,6 +20361,7 @@
                 <w:sz w:val="17"/>
                 <w:szCs w:val="17"/>
               </w:rPr>
+              <w:lastRenderedPageBreak/>
               <w:t>DifDistanciaMaximaKm</w:t>
             </w:r>
           </w:p>
@@ -21508,7 +22687,6 @@
                 <w:sz w:val="17"/>
                 <w:szCs w:val="17"/>
               </w:rPr>
-              <w:lastRenderedPageBreak/>
               <w:t>EstAltitud</w:t>
             </w:r>
           </w:p>
@@ -21775,6 +22953,7 @@
                 <w:sz w:val="17"/>
                 <w:szCs w:val="17"/>
               </w:rPr>
+              <w:lastRenderedPageBreak/>
               <w:t>EstEstado</w:t>
             </w:r>
           </w:p>
@@ -24144,7 +25323,6 @@
                 <w:sz w:val="17"/>
                 <w:szCs w:val="17"/>
               </w:rPr>
-              <w:lastRenderedPageBreak/>
               <w:t>ZonCostoAprox</w:t>
             </w:r>
           </w:p>
@@ -24278,6 +25456,7 @@
                 <w:sz w:val="17"/>
                 <w:szCs w:val="17"/>
               </w:rPr>
+              <w:lastRenderedPageBreak/>
               <w:t>ZonCupoMaximoDiario</w:t>
             </w:r>
           </w:p>
@@ -26301,7 +27480,6 @@
                 <w:sz w:val="17"/>
                 <w:szCs w:val="17"/>
               </w:rPr>
-              <w:lastRenderedPageBreak/>
               <w:t>RutIdEstacionOrigen</w:t>
             </w:r>
           </w:p>
@@ -26443,6 +27621,7 @@
                 <w:sz w:val="17"/>
                 <w:szCs w:val="17"/>
               </w:rPr>
+              <w:lastRenderedPageBreak/>
               <w:t>RutIdZonaDestino</w:t>
             </w:r>
           </w:p>
@@ -33123,6 +34302,76 @@
           </w:p>
         </w:tc>
       </w:tr>
+      <w:tr>
+        <w:tc>
+          <w:tcPr>
+            <w:tcW w:w="500" w:type="pct"/>
+            <w:tcMar>
+              <w:top w:w="80" w:type="dxa"/>
+              <w:left w:w="100" w:type="dxa"/>
+              <w:bottom w:w="80" w:type="dxa"/>
+              <w:right w:w="100" w:type="dxa"/>
+            </w:tcMar>
+            <w:vAlign w:val="center"/>
+          </w:tcPr>
+          <w:p>
+            <w:r>
+              <w:t>HU-09</w:t>
+            </w:r>
+          </w:p>
+        </w:tc>
+        <w:tc>
+          <w:tcPr>
+            <w:tcW w:w="3300" w:type="pct"/>
+            <w:tcMar>
+              <w:top w:w="80" w:type="dxa"/>
+              <w:left w:w="100" w:type="dxa"/>
+              <w:bottom w:w="80" w:type="dxa"/>
+              <w:right w:w="100" w:type="dxa"/>
+            </w:tcMar>
+            <w:vAlign w:val="center"/>
+          </w:tcPr>
+          <w:p>
+            <w:r>
+              <w:t>Como turista, quiero consultar mi historial de informes de visita para revisar itinerarios y descargar los PDF generados.</w:t>
+            </w:r>
+          </w:p>
+        </w:tc>
+        <w:tc>
+          <w:tcPr>
+            <w:tcW w:w="500" w:type="pct"/>
+            <w:tcMar>
+              <w:top w:w="80" w:type="dxa"/>
+              <w:left w:w="100" w:type="dxa"/>
+              <w:bottom w:w="80" w:type="dxa"/>
+              <w:right w:w="100" w:type="dxa"/>
+            </w:tcMar>
+            <w:vAlign w:val="center"/>
+          </w:tcPr>
+          <w:p>
+            <w:r>
+              <w:t>5</w:t>
+            </w:r>
+          </w:p>
+        </w:tc>
+        <w:tc>
+          <w:tcPr>
+            <w:tcW w:w="700" w:type="pct"/>
+            <w:tcMar>
+              <w:top w:w="80" w:type="dxa"/>
+              <w:left w:w="100" w:type="dxa"/>
+              <w:bottom w:w="80" w:type="dxa"/>
+              <w:right w:w="100" w:type="dxa"/>
+            </w:tcMar>
+            <w:vAlign w:val="center"/>
+          </w:tcPr>
+          <w:p>
+            <w:r>
+              <w:t>Media</w:t>
+            </w:r>
+          </w:p>
+        </w:tc>
+      </w:tr>
     </w:tbl>
     <w:p>
       <w:pPr>
@@ -33219,6 +34468,7 @@
         <w:jc w:val="both"/>
       </w:pPr>
       <w:r>
+        <w:lastRenderedPageBreak/>
         <w:t>Configuración de DBeaver para la gestión visual de la base de datos.</w:t>
       </w:r>
     </w:p>
@@ -33247,7 +34497,6 @@
         <w:jc w:val="both"/>
       </w:pPr>
       <w:r>
-        <w:lastRenderedPageBreak/>
         <w:t>Diseño inicial del Modelo Entidad-Relación (MER) y de la arquitectura lógica y física del sistema.</w:t>
       </w:r>
     </w:p>
@@ -33362,7 +34611,13 @@
         <w:jc w:val="both"/>
       </w:pPr>
       <w:r>
-        <w:t>Implementación del CRUD de ZonaTuristica para Travel Group Perú mediante ZonaTuristicaService (RF-10).</w:t>
+        <w:t>Implementación del CRUD de ZonaTuristica para Travel Group Perú mediante ZonaTuristicaService (RF-1</w:t>
+      </w:r>
+      <w:r>
+        <w:t>1</w:t>
+      </w:r>
+      <w:r>
+        <w:t>).</w:t>
       </w:r>
     </w:p>
     <w:p>
@@ -33476,7 +34731,13 @@
         <w:jc w:val="both"/>
       </w:pPr>
       <w:r>
-        <w:t>Implementación de SenamhiClient y de la tabla PrevisionClima, con sincronización diaria (RF-14).</w:t>
+        <w:t>Implementación de SenamhiClient y de la tabla PrevisionClima, con sincronización diaria (RF-1</w:t>
+      </w:r>
+      <w:r>
+        <w:t>5</w:t>
+      </w:r>
+      <w:r>
+        <w:t>).</w:t>
       </w:r>
     </w:p>
     <w:p>
@@ -33647,7 +34908,13 @@
         <w:jc w:val="both"/>
       </w:pPr>
       <w:r>
-        <w:t>Implementación de la tabla AuditoriaLog y del interceptor que registra cada operación administrativa y cada sincronización externa (RF-15, RNF-07).</w:t>
+        <w:t>Implementación de la tabla AuditoriaLog y del interceptor que registra cada operación administrativa y cada sincronización externa (RF-1</w:t>
+      </w:r>
+      <w:r>
+        <w:t>6</w:t>
+      </w:r>
+      <w:r>
+        <w:t>, RNF-07).</w:t>
       </w:r>
     </w:p>
     <w:p>
@@ -33761,7 +35028,19 @@
         <w:jc w:val="both"/>
       </w:pPr>
       <w:r>
-        <w:t>Implementación de AforoService y de la tabla ControlAforo, con validación e incremento atómico del cupo utilizado antes de confirmar el informe (RF-16, RF-17, RNF-08).</w:t>
+        <w:t>Implementación de AforoService y de la tabla ControlAforo, con validación e incremento atómico del cupo utilizado antes de confirmar el informe (RF-1</w:t>
+      </w:r>
+      <w:r>
+        <w:t>7</w:t>
+      </w:r>
+      <w:r>
+        <w:t>, RF-1</w:t>
+      </w:r>
+      <w:r>
+        <w:t>8</w:t>
+      </w:r>
+      <w:r>
+        <w:t>, RNF-08).</w:t>
       </w:r>
     </w:p>
     <w:p>
@@ -33775,7 +35054,13 @@
         <w:jc w:val="both"/>
       </w:pPr>
       <w:r>
-        <w:t>Extensión del CRUD de ZonaTuristica para permitir a Travel Group Perú configurar el campo ZonCupoMaximoDiario (RF-17).</w:t>
+        <w:t>Extensión del CRUD de ZonaTuristica para permitir a Travel Group Perú configurar el campo ZonCupoMaximoDiario (RF-1</w:t>
+      </w:r>
+      <w:r>
+        <w:t>8</w:t>
+      </w:r>
+      <w:r>
+        <w:t>).</w:t>
       </w:r>
     </w:p>
     <w:p>
@@ -34154,7 +35439,7 @@
         <w:t xml:space="preserve">Componentes Evaluados: </w:t>
       </w:r>
       <w:r>
-        <w:t xml:space="preserve"> RutaPeatonalService, SenamhiClient, PeruRailClient, AforoService, TarifaService y AuditoriaService. Las pruebas se concentran en los métodos encargados de calcular la ruta peatonal (calcularRutaPeatonalIdaVuelta), procesar el feed climático (procesarFeedSenamhi), validar la tarifa del tren (validarTarifaPeruRail), validar el aforo disponible de una zona turística para todo el grupo (validarAforoDisponible), resolver la categoría tarifaria que corresponde a cada edad (categoriaPorEdad) y registrar la auditoría de las operaciones administrativas (registrarAuditoria).</w:t>
+        <w:t xml:space="preserve"> RutaPeatonalService, SenamhiClient, PeruRailClient, AforoService, TarifaService, AuditoriaService, ServicioTrenService e InformeService. Las pruebas se concentran en los métodos encargados de calcular la ruta peatonal (calcularRutaPeatonalIdaVuelta), procesar el feed climático (procesarFeedSenamhi), validar la tarifa del tren (validarTarifaPeruRail), validar el aforo disponible de una zona turística para todo el grupo (validarAforoDisponible), resolver la categoría tarifaria que corresponde a cada edad (categoriaPorEdad) y registrar la auditoría de las operaciones administrativas (registrarAuditoria) eliminar servicios de tren registrando su trazabilidad en auditoría (eliminar) y consultar el historial de informes por usuario autenticado (obtenerInformesPorUsuario).</w:t>
       </w:r>
     </w:p>
     <w:p>
@@ -34166,20 +35451,6 @@
           <w:bCs/>
         </w:rPr>
       </w:pPr>
-      <w:r>
-        <w:rPr>
-          <w:b/>
-          <w:bCs/>
-        </w:rPr>
-        <w:br/>
-      </w:r>
-      <w:r>
-        <w:rPr>
-          <w:b/>
-          <w:bCs/>
-        </w:rPr>
-        <w:br/>
-      </w:r>
       <w:r>
         <w:rPr>
           <w:b/>
@@ -34243,6 +35514,20 @@
           <w:bCs/>
         </w:rPr>
         <w:br/>
+      </w:r>
+      <w:r>
+        <w:rPr>
+          <w:b/>
+          <w:bCs/>
+        </w:rPr>
+        <w:br/>
+      </w:r>
+      <w:r>
+        <w:rPr>
+          <w:b/>
+          <w:bCs/>
+        </w:rPr>
+        <w:br/>
         <w:t>Matriz de casos de prueba de caja blanca</w:t>
       </w:r>
     </w:p>
@@ -34967,6 +36252,7 @@
                 <w:sz w:val="17"/>
                 <w:szCs w:val="17"/>
               </w:rPr>
+              <w:lastRenderedPageBreak/>
               <w:t>CB-05</w:t>
             </w:r>
           </w:p>
@@ -35098,7 +36384,6 @@
                 <w:sz w:val="17"/>
                 <w:szCs w:val="17"/>
               </w:rPr>
-              <w:lastRenderedPageBreak/>
               <w:t>CB-06</w:t>
             </w:r>
           </w:p>
@@ -35623,6 +36908,7 @@
                 <w:sz w:val="17"/>
                 <w:szCs w:val="17"/>
               </w:rPr>
+              <w:lastRenderedPageBreak/>
               <w:t>CB-10</w:t>
             </w:r>
           </w:p>
@@ -35754,7 +37040,6 @@
                 <w:sz w:val="17"/>
                 <w:szCs w:val="17"/>
               </w:rPr>
-              <w:lastRenderedPageBreak/>
               <w:t>CB-11</w:t>
             </w:r>
           </w:p>
@@ -35840,6 +37125,268 @@
                 <w:szCs w:val="17"/>
               </w:rPr>
               <w:t>throw TarifaInvalidaException("No hay tarifa configurada para la edad 130 en el ámbito Tren").</w:t>
+            </w:r>
+          </w:p>
+        </w:tc>
+        <w:tc>
+          <w:tcPr>
+            <w:tcW w:w="307" w:type="pct"/>
+            <w:tcMar>
+              <w:top w:w="60" w:type="dxa"/>
+              <w:left w:w="80" w:type="dxa"/>
+              <w:bottom w:w="60" w:type="dxa"/>
+              <w:right w:w="80" w:type="dxa"/>
+            </w:tcMar>
+            <w:vAlign w:val="center"/>
+          </w:tcPr>
+          <w:p>
+            <w:r>
+              <w:rPr>
+                <w:sz w:val="17"/>
+                <w:szCs w:val="17"/>
+              </w:rPr>
+              <w:t>Exitoso</w:t>
+            </w:r>
+          </w:p>
+        </w:tc>
+      </w:tr>
+      <w:tr>
+        <w:trPr>
+          <w:cantSplit/>
+        </w:trPr>
+        <w:tc>
+          <w:tcPr>
+            <w:tcW w:w="184" w:type="pct"/>
+            <w:tcMar>
+              <w:top w:w="60" w:type="dxa"/>
+              <w:left w:w="80" w:type="dxa"/>
+              <w:bottom w:w="60" w:type="dxa"/>
+              <w:right w:w="80" w:type="dxa"/>
+            </w:tcMar>
+            <w:vAlign w:val="center"/>
+          </w:tcPr>
+          <w:p>
+            <w:r>
+              <w:rPr>
+                <w:sz w:val="17"/>
+                <w:szCs w:val="17"/>
+              </w:rPr>
+              <w:t>CB-12</w:t>
+            </w:r>
+          </w:p>
+        </w:tc>
+        <w:tc>
+          <w:tcPr>
+            <w:tcW w:w="1111" w:type="pct"/>
+            <w:tcMar>
+              <w:top w:w="60" w:type="dxa"/>
+              <w:left w:w="80" w:type="dxa"/>
+              <w:bottom w:w="60" w:type="dxa"/>
+              <w:right w:w="80" w:type="dxa"/>
+            </w:tcMar>
+            <w:vAlign w:val="center"/>
+          </w:tcPr>
+          <w:p>
+            <w:r>
+              <w:rPr>
+                <w:sz w:val="17"/>
+                <w:szCs w:val="17"/>
+              </w:rPr>
+              <w:t>eliminar()</w:t>
+            </w:r>
+          </w:p>
+        </w:tc>
+        <w:tc>
+          <w:tcPr>
+            <w:tcW w:w="817" w:type="pct"/>
+            <w:tcMar>
+              <w:top w:w="60" w:type="dxa"/>
+              <w:left w:w="80" w:type="dxa"/>
+              <w:bottom w:w="60" w:type="dxa"/>
+              <w:right w:w="80" w:type="dxa"/>
+            </w:tcMar>
+            <w:vAlign w:val="center"/>
+          </w:tcPr>
+          <w:p>
+            <w:r>
+              <w:rPr>
+                <w:sz w:val="17"/>
+                <w:szCs w:val="17"/>
+              </w:rPr>
+              <w:t>Ruta Única (Persistencia / Auditoría): servicio de tren existente en la base de datos; el sistema elimina físicamente el registro de ServicioTren y registra la operación en AuditoriaLog con tipo DELETE, preservando los datos anteriores y valor nuevo nulo.</w:t>
+            </w:r>
+          </w:p>
+        </w:tc>
+        <w:tc>
+          <w:tcPr>
+            <w:tcW w:w="1317" w:type="pct"/>
+            <w:tcMar>
+              <w:top w:w="60" w:type="dxa"/>
+              <w:left w:w="80" w:type="dxa"/>
+              <w:bottom w:w="60" w:type="dxa"/>
+              <w:right w:w="80" w:type="dxa"/>
+            </w:tcMar>
+            <w:vAlign w:val="center"/>
+          </w:tcPr>
+          <w:p>
+            <w:r>
+              <w:rPr>
+                <w:sz w:val="17"/>
+                <w:szCs w:val="17"/>
+              </w:rPr>
+              <w:t>id = 10 (Servicio existente San Pedro - Ollantaytambo); usuario = "rail_luis"</w:t>
+            </w:r>
+          </w:p>
+        </w:tc>
+        <w:tc>
+          <w:tcPr>
+            <w:tcW w:w="1264" w:type="pct"/>
+            <w:tcMar>
+              <w:top w:w="60" w:type="dxa"/>
+              <w:left w:w="80" w:type="dxa"/>
+              <w:bottom w:w="60" w:type="dxa"/>
+              <w:right w:w="80" w:type="dxa"/>
+            </w:tcMar>
+            <w:vAlign w:val="center"/>
+          </w:tcPr>
+          <w:p>
+            <w:r>
+              <w:rPr>
+                <w:sz w:val="17"/>
+                <w:szCs w:val="17"/>
+              </w:rPr>
+              <w:t>status = 200 OK (servicio eliminado de BD y auditoría registrada con AudOperacion='DELETE').</w:t>
+            </w:r>
+          </w:p>
+        </w:tc>
+        <w:tc>
+          <w:tcPr>
+            <w:tcW w:w="307" w:type="pct"/>
+            <w:tcMar>
+              <w:top w:w="60" w:type="dxa"/>
+              <w:left w:w="80" w:type="dxa"/>
+              <w:bottom w:w="60" w:type="dxa"/>
+              <w:right w:w="80" w:type="dxa"/>
+            </w:tcMar>
+            <w:vAlign w:val="center"/>
+          </w:tcPr>
+          <w:p>
+            <w:r>
+              <w:rPr>
+                <w:sz w:val="17"/>
+                <w:szCs w:val="17"/>
+              </w:rPr>
+              <w:t>Exitoso</w:t>
+            </w:r>
+          </w:p>
+        </w:tc>
+      </w:tr>
+      <w:tr>
+        <w:trPr>
+          <w:cantSplit/>
+        </w:trPr>
+        <w:tc>
+          <w:tcPr>
+            <w:tcW w:w="184" w:type="pct"/>
+            <w:tcMar>
+              <w:top w:w="60" w:type="dxa"/>
+              <w:left w:w="80" w:type="dxa"/>
+              <w:bottom w:w="60" w:type="dxa"/>
+              <w:right w:w="80" w:type="dxa"/>
+            </w:tcMar>
+            <w:vAlign w:val="center"/>
+          </w:tcPr>
+          <w:p>
+            <w:r>
+              <w:rPr>
+                <w:sz w:val="17"/>
+                <w:szCs w:val="17"/>
+              </w:rPr>
+              <w:t>CB-13</w:t>
+            </w:r>
+          </w:p>
+        </w:tc>
+        <w:tc>
+          <w:tcPr>
+            <w:tcW w:w="1111" w:type="pct"/>
+            <w:tcMar>
+              <w:top w:w="60" w:type="dxa"/>
+              <w:left w:w="80" w:type="dxa"/>
+              <w:bottom w:w="60" w:type="dxa"/>
+              <w:right w:w="80" w:type="dxa"/>
+            </w:tcMar>
+            <w:vAlign w:val="center"/>
+          </w:tcPr>
+          <w:p>
+            <w:r>
+              <w:rPr>
+                <w:sz w:val="17"/>
+                <w:szCs w:val="17"/>
+              </w:rPr>
+              <w:t>obtenerInformesPorUsuario()</w:t>
+            </w:r>
+          </w:p>
+        </w:tc>
+        <w:tc>
+          <w:tcPr>
+            <w:tcW w:w="817" w:type="pct"/>
+            <w:tcMar>
+              <w:top w:w="60" w:type="dxa"/>
+              <w:left w:w="80" w:type="dxa"/>
+              <w:bottom w:w="60" w:type="dxa"/>
+              <w:right w:w="80" w:type="dxa"/>
+            </w:tcMar>
+            <w:vAlign w:val="center"/>
+          </w:tcPr>
+          <w:p>
+            <w:r>
+              <w:rPr>
+                <w:sz w:val="17"/>
+                <w:szCs w:val="17"/>
+              </w:rPr>
+              <w:t>Ruta Única (Persistencia / Consulta): usuario autenticado con informes registrados; el sistema ejecuta la consulta derivada por nombre de usuario con carga impaciente (@EntityGraph) de rutas y zonas, retornando la lista ordenada descendentemente por fecha de emisión.</w:t>
+            </w:r>
+          </w:p>
+        </w:tc>
+        <w:tc>
+          <w:tcPr>
+            <w:tcW w:w="1317" w:type="pct"/>
+            <w:tcMar>
+              <w:top w:w="60" w:type="dxa"/>
+              <w:left w:w="80" w:type="dxa"/>
+              <w:bottom w:w="60" w:type="dxa"/>
+              <w:right w:w="80" w:type="dxa"/>
+            </w:tcMar>
+            <w:vAlign w:val="center"/>
+          </w:tcPr>
+          <w:p>
+            <w:r>
+              <w:rPr>
+                <w:sz w:val="17"/>
+                <w:szCs w:val="17"/>
+              </w:rPr>
+              <w:t>nombreUsuario = "turista_jose"</w:t>
+            </w:r>
+          </w:p>
+        </w:tc>
+        <w:tc>
+          <w:tcPr>
+            <w:tcW w:w="1264" w:type="pct"/>
+            <w:tcMar>
+              <w:top w:w="60" w:type="dxa"/>
+              <w:left w:w="80" w:type="dxa"/>
+              <w:bottom w:w="60" w:type="dxa"/>
+              <w:right w:w="80" w:type="dxa"/>
+            </w:tcMar>
+            <w:vAlign w:val="center"/>
+          </w:tcPr>
+          <w:p>
+            <w:r>
+              <w:rPr>
+                <w:sz w:val="17"/>
+                <w:szCs w:val="17"/>
+              </w:rPr>
+              <w:t>return List&lt;InformePlanificacion&gt; (lista de informes ordenados por InfFechaEmision DESC).</w:t>
             </w:r>
           </w:p>
         </w:tc>
@@ -35893,6 +37440,7 @@
           <w:sz w:val="22"/>
           <w:szCs w:val="22"/>
         </w:rPr>
+        <w:lastRenderedPageBreak/>
         <w:t>8.2.2. Pruebas de caja negra</w:t>
       </w:r>
       <w:bookmarkEnd w:id="35"/>
@@ -36422,23 +37970,7 @@
                 <w:sz w:val="17"/>
                 <w:szCs w:val="17"/>
               </w:rPr>
-              <w:t>Estación = "</w:t>
-            </w:r>
-            <w:proofErr w:type="spellStart"/>
-            <w:r>
-              <w:rPr>
-                <w:sz w:val="17"/>
-                <w:szCs w:val="17"/>
-              </w:rPr>
-              <w:t>Poroy</w:t>
-            </w:r>
-            <w:proofErr w:type="spellEnd"/>
-            <w:r>
-              <w:rPr>
-                <w:sz w:val="17"/>
-                <w:szCs w:val="17"/>
-              </w:rPr>
-              <w:t>" (EstEstado=Inactiva)</w:t>
+              <w:t>Estación = "Poroy" (EstEstado=Inactiva)</w:t>
             </w:r>
           </w:p>
         </w:tc>
@@ -36506,7 +38038,6 @@
                 <w:sz w:val="17"/>
                 <w:szCs w:val="17"/>
               </w:rPr>
-              <w:lastRenderedPageBreak/>
               <w:t>CN-03</w:t>
             </w:r>
           </w:p>
@@ -36586,21 +38117,12 @@
             <w:vAlign w:val="center"/>
           </w:tcPr>
           <w:p>
-            <w:proofErr w:type="spellStart"/>
-            <w:r>
-              <w:rPr>
-                <w:sz w:val="17"/>
-                <w:szCs w:val="17"/>
-              </w:rPr>
-              <w:t>ZonaTuristica</w:t>
-            </w:r>
-            <w:proofErr w:type="spellEnd"/>
-            <w:r>
-              <w:rPr>
-                <w:sz w:val="17"/>
-                <w:szCs w:val="17"/>
-              </w:rPr>
-              <w:t>=Fortaleza de Ollantaytambo; Fecha de visita=30/08/2026</w:t>
+            <w:r>
+              <w:rPr>
+                <w:sz w:val="17"/>
+                <w:szCs w:val="17"/>
+              </w:rPr>
+              <w:t>ZonaTuristica=Fortaleza de Ollantaytambo; Fecha de visita=30/08/2026</w:t>
             </w:r>
           </w:p>
         </w:tc>
@@ -36668,6 +38190,7 @@
                 <w:sz w:val="17"/>
                 <w:szCs w:val="17"/>
               </w:rPr>
+              <w:lastRenderedPageBreak/>
               <w:t>CN-04</w:t>
             </w:r>
           </w:p>
@@ -36763,37 +38286,12 @@
             <w:vAlign w:val="center"/>
           </w:tcPr>
           <w:p>
-            <w:proofErr w:type="spellStart"/>
-            <w:r>
-              <w:rPr>
-                <w:sz w:val="17"/>
-                <w:szCs w:val="17"/>
-              </w:rPr>
-              <w:t>ZonNombre</w:t>
-            </w:r>
-            <w:proofErr w:type="spellEnd"/>
-            <w:r>
-              <w:rPr>
-                <w:sz w:val="17"/>
-                <w:szCs w:val="17"/>
-              </w:rPr>
-              <w:t xml:space="preserve">="Salinas de Maras"; Preferencias=[Naturaleza]; </w:t>
-            </w:r>
-            <w:proofErr w:type="spellStart"/>
-            <w:r>
-              <w:rPr>
-                <w:sz w:val="17"/>
-                <w:szCs w:val="17"/>
-              </w:rPr>
-              <w:t>ZonIdEstacionCercana</w:t>
-            </w:r>
-            <w:proofErr w:type="spellEnd"/>
-            <w:r>
-              <w:rPr>
-                <w:sz w:val="17"/>
-                <w:szCs w:val="17"/>
-              </w:rPr>
-              <w:t>=Urubamba</w:t>
+            <w:r>
+              <w:rPr>
+                <w:sz w:val="17"/>
+                <w:szCs w:val="17"/>
+              </w:rPr>
+              <w:t>ZonNombre="Salinas de Maras"; Preferencias=[Naturaleza]; ZonIdEstacionCercana=Urubamba</w:t>
             </w:r>
           </w:p>
         </w:tc>
@@ -36814,23 +38312,7 @@
                 <w:sz w:val="17"/>
                 <w:szCs w:val="17"/>
               </w:rPr>
-              <w:t xml:space="preserve">El sistema guarda la zona turística, la muestra en el listado y genera un registro en </w:t>
-            </w:r>
-            <w:proofErr w:type="spellStart"/>
-            <w:r>
-              <w:rPr>
-                <w:sz w:val="17"/>
-                <w:szCs w:val="17"/>
-              </w:rPr>
-              <w:t>AuditoriaLog</w:t>
-            </w:r>
-            <w:proofErr w:type="spellEnd"/>
-            <w:r>
-              <w:rPr>
-                <w:sz w:val="17"/>
-                <w:szCs w:val="17"/>
-              </w:rPr>
-              <w:t>.</w:t>
+              <w:t>El sistema guarda la zona turística, la muestra en el listado y genera un registro en AuditoriaLog.</w:t>
             </w:r>
           </w:p>
         </w:tc>
@@ -36972,21 +38454,12 @@
             <w:vAlign w:val="center"/>
           </w:tcPr>
           <w:p>
-            <w:proofErr w:type="spellStart"/>
-            <w:r>
-              <w:rPr>
-                <w:sz w:val="17"/>
-                <w:szCs w:val="17"/>
-              </w:rPr>
-              <w:t>ZonNombre</w:t>
-            </w:r>
-            <w:proofErr w:type="spellEnd"/>
-            <w:r>
-              <w:rPr>
-                <w:sz w:val="17"/>
-                <w:szCs w:val="17"/>
-              </w:rPr>
-              <w:t>="Mirador X"; Preferencias=(ninguna seleccionada)</w:t>
+            <w:r>
+              <w:rPr>
+                <w:sz w:val="17"/>
+                <w:szCs w:val="17"/>
+              </w:rPr>
+              <w:t>ZonNombre="Mirador X"; Preferencias=(ninguna seleccionada)</w:t>
             </w:r>
           </w:p>
         </w:tc>
@@ -37235,7 +38708,21 @@
                 <w:sz w:val="17"/>
                 <w:szCs w:val="17"/>
               </w:rPr>
-              <w:t>Generar informe consolidado de visita para un grupo (RF-08, RF-18).</w:t>
+              <w:t>Generar informe consolidado de visita para un grupo (RF-08, RF-1</w:t>
+            </w:r>
+            <w:r>
+              <w:rPr>
+                <w:sz w:val="17"/>
+                <w:szCs w:val="17"/>
+              </w:rPr>
+              <w:t>9</w:t>
+            </w:r>
+            <w:r>
+              <w:rPr>
+                <w:sz w:val="17"/>
+                <w:szCs w:val="17"/>
+              </w:rPr>
+              <w:t>).</w:t>
             </w:r>
           </w:p>
         </w:tc>
@@ -37384,7 +38871,6 @@
                 <w:sz w:val="17"/>
                 <w:szCs w:val="17"/>
               </w:rPr>
-              <w:lastRenderedPageBreak/>
               <w:t>CN-08</w:t>
             </w:r>
           </w:p>
@@ -37448,23 +38934,7 @@
                 <w:sz w:val="17"/>
                 <w:szCs w:val="17"/>
               </w:rPr>
-              <w:t>1) Intentar acceder directamente a la URL del módulo de administración de zonas turísticas (/</w:t>
-            </w:r>
-            <w:proofErr w:type="spellStart"/>
-            <w:r>
-              <w:rPr>
-                <w:sz w:val="17"/>
-                <w:szCs w:val="17"/>
-              </w:rPr>
-              <w:t>admin</w:t>
-            </w:r>
-            <w:proofErr w:type="spellEnd"/>
-            <w:r>
-              <w:rPr>
-                <w:sz w:val="17"/>
-                <w:szCs w:val="17"/>
-              </w:rPr>
-              <w:t>/zonas).</w:t>
+              <w:t>1) Intentar acceder directamente a la URL del módulo de administración de zonas turísticas (/admin/zonas).</w:t>
             </w:r>
           </w:p>
         </w:tc>
@@ -37553,6 +39023,7 @@
                 <w:sz w:val="17"/>
                 <w:szCs w:val="17"/>
               </w:rPr>
+              <w:lastRenderedPageBreak/>
               <w:t>CN-09</w:t>
             </w:r>
           </w:p>
@@ -37595,55 +39066,7 @@
                 <w:sz w:val="17"/>
                 <w:szCs w:val="17"/>
               </w:rPr>
-              <w:t xml:space="preserve">La zona turística tiene </w:t>
-            </w:r>
-            <w:proofErr w:type="spellStart"/>
-            <w:r>
-              <w:rPr>
-                <w:sz w:val="17"/>
-                <w:szCs w:val="17"/>
-              </w:rPr>
-              <w:t>ZonCupoMaximoDiario</w:t>
-            </w:r>
-            <w:proofErr w:type="spellEnd"/>
-            <w:r>
-              <w:rPr>
-                <w:sz w:val="17"/>
-                <w:szCs w:val="17"/>
-              </w:rPr>
-              <w:t xml:space="preserve"> configurado y el aforo de la fecha ya fue alcanzado (</w:t>
-            </w:r>
-            <w:proofErr w:type="spellStart"/>
-            <w:r>
-              <w:rPr>
-                <w:sz w:val="17"/>
-                <w:szCs w:val="17"/>
-              </w:rPr>
-              <w:t>AfoCupoUtilizado</w:t>
-            </w:r>
-            <w:proofErr w:type="spellEnd"/>
-            <w:r>
-              <w:rPr>
-                <w:sz w:val="17"/>
-                <w:szCs w:val="17"/>
-              </w:rPr>
-              <w:t xml:space="preserve"> = </w:t>
-            </w:r>
-            <w:proofErr w:type="spellStart"/>
-            <w:r>
-              <w:rPr>
-                <w:sz w:val="17"/>
-                <w:szCs w:val="17"/>
-              </w:rPr>
-              <w:t>ZonCupoMaximoDiario</w:t>
-            </w:r>
-            <w:proofErr w:type="spellEnd"/>
-            <w:r>
-              <w:rPr>
-                <w:sz w:val="17"/>
-                <w:szCs w:val="17"/>
-              </w:rPr>
-              <w:t>).</w:t>
+              <w:t>La zona turística tiene ZonCupoMaximoDiario configurado y el aforo de la fecha ya fue alcanzado (AfoCupoUtilizado = ZonCupoMaximoDiario).</w:t>
             </w:r>
           </w:p>
         </w:tc>
@@ -37696,21 +39119,12 @@
             <w:vAlign w:val="center"/>
           </w:tcPr>
           <w:p>
-            <w:proofErr w:type="spellStart"/>
-            <w:r>
-              <w:rPr>
-                <w:sz w:val="17"/>
-                <w:szCs w:val="17"/>
-              </w:rPr>
-              <w:t>ZonaTuristica</w:t>
-            </w:r>
-            <w:proofErr w:type="spellEnd"/>
-            <w:r>
-              <w:rPr>
-                <w:sz w:val="17"/>
-                <w:szCs w:val="17"/>
-              </w:rPr>
-              <w:t>=Fortaleza de Ollantaytambo; Fecha=30/08/2026 (aforo completo)</w:t>
+            <w:r>
+              <w:rPr>
+                <w:sz w:val="17"/>
+                <w:szCs w:val="17"/>
+              </w:rPr>
+              <w:t>ZonaTuristica=Fortaleza de Ollantaytambo; Fecha=30/08/2026 (aforo completo)</w:t>
             </w:r>
           </w:p>
         </w:tc>
@@ -37873,21 +39287,12 @@
             <w:vAlign w:val="center"/>
           </w:tcPr>
           <w:p>
-            <w:proofErr w:type="spellStart"/>
-            <w:r>
-              <w:rPr>
-                <w:sz w:val="17"/>
-                <w:szCs w:val="17"/>
-              </w:rPr>
-              <w:t>ZonNombre</w:t>
-            </w:r>
-            <w:proofErr w:type="spellEnd"/>
-            <w:r>
-              <w:rPr>
-                <w:sz w:val="17"/>
-                <w:szCs w:val="17"/>
-              </w:rPr>
-              <w:t>="Fortaleza de Ollantaytambo"; Preferencias=[Historia/Cultura, Naturaleza]</w:t>
+            <w:r>
+              <w:rPr>
+                <w:sz w:val="17"/>
+                <w:szCs w:val="17"/>
+              </w:rPr>
+              <w:t>ZonNombre="Fortaleza de Ollantaytambo"; Preferencias=[Historia/Cultura, Naturaleza]</w:t>
             </w:r>
           </w:p>
         </w:tc>
@@ -37908,23 +39313,7 @@
                 <w:sz w:val="17"/>
                 <w:szCs w:val="17"/>
               </w:rPr>
-              <w:t xml:space="preserve">El sistema guarda ambas asociaciones en </w:t>
-            </w:r>
-            <w:proofErr w:type="spellStart"/>
-            <w:r>
-              <w:rPr>
-                <w:sz w:val="17"/>
-                <w:szCs w:val="17"/>
-              </w:rPr>
-              <w:t>ZonaPreferencia</w:t>
-            </w:r>
-            <w:proofErr w:type="spellEnd"/>
-            <w:r>
-              <w:rPr>
-                <w:sz w:val="17"/>
-                <w:szCs w:val="17"/>
-              </w:rPr>
-              <w:t>, y la zona aparece en los resultados de búsqueda tanto para la preferencia "Naturaleza" como para "Historia/Cultura", de forma independiente.</w:t>
+              <w:t>El sistema guarda ambas asociaciones en ZonaPreferencia, y la zona aparece en los resultados de búsqueda tanto para la preferencia "Naturaleza" como para "Historia/Cultura", de forma independiente.</w:t>
             </w:r>
           </w:p>
         </w:tc>
@@ -37992,7 +39381,21 @@
                 <w:sz w:val="17"/>
                 <w:szCs w:val="17"/>
               </w:rPr>
-              <w:t>Cobrar la tarifa que corresponde a cada edad en cada proveedor (RF-18).</w:t>
+              <w:t>Cobrar la tarifa que corresponde a cada edad en cada proveedor (RF-1</w:t>
+            </w:r>
+            <w:r>
+              <w:rPr>
+                <w:sz w:val="17"/>
+                <w:szCs w:val="17"/>
+              </w:rPr>
+              <w:t>9</w:t>
+            </w:r>
+            <w:r>
+              <w:rPr>
+                <w:sz w:val="17"/>
+                <w:szCs w:val="17"/>
+              </w:rPr>
+              <w:t>).</w:t>
             </w:r>
           </w:p>
         </w:tc>
@@ -38013,23 +39416,7 @@
                 <w:sz w:val="17"/>
                 <w:szCs w:val="17"/>
               </w:rPr>
-              <w:t xml:space="preserve">Existen los tramos de edad sembrados en </w:t>
-            </w:r>
-            <w:proofErr w:type="spellStart"/>
-            <w:r>
-              <w:rPr>
-                <w:sz w:val="17"/>
-                <w:szCs w:val="17"/>
-              </w:rPr>
-              <w:t>CategoriaVisitante</w:t>
-            </w:r>
-            <w:proofErr w:type="spellEnd"/>
-            <w:r>
-              <w:rPr>
-                <w:sz w:val="17"/>
-                <w:szCs w:val="17"/>
-              </w:rPr>
-              <w:t xml:space="preserve"> para los ámbitos Tren y Zona.</w:t>
+              <w:t>Existen los tramos de edad sembrados en CategoriaVisitante para los ámbitos Tren y Zona.</w:t>
             </w:r>
           </w:p>
         </w:tc>
@@ -38101,23 +39488,7 @@
                 <w:sz w:val="17"/>
                 <w:szCs w:val="17"/>
               </w:rPr>
-              <w:t xml:space="preserve">El sistema cobra tarifa de adulto en el tren (S/ 145.00) y tarifa de menor en la zona (S/ 47.60), con un total de S/ 192.60, porque </w:t>
-            </w:r>
-            <w:proofErr w:type="spellStart"/>
-            <w:r>
-              <w:rPr>
-                <w:sz w:val="17"/>
-                <w:szCs w:val="17"/>
-              </w:rPr>
-              <w:t>PeruRail</w:t>
-            </w:r>
-            <w:proofErr w:type="spellEnd"/>
-            <w:r>
-              <w:rPr>
-                <w:sz w:val="17"/>
-                <w:szCs w:val="17"/>
-              </w:rPr>
-              <w:t xml:space="preserve"> corta la tarifa de niño a los 12 años y la zona la mantiene hasta los 17.</w:t>
+              <w:t>El sistema cobra tarifa de adulto en el tren (S/ 145.00) y tarifa de menor en la zona (S/ 47.60), con un total de S/ 192.60, porque PeruRail corta la tarifa de niño a los 12 años y la zona la mantiene hasta los 17.</w:t>
             </w:r>
           </w:p>
         </w:tc>
@@ -38186,7 +39557,21 @@
                 <w:sz w:val="17"/>
                 <w:szCs w:val="17"/>
               </w:rPr>
-              <w:t>Rechazar un grupo que no cabe completo en el aforo (RF-16, CU-08).</w:t>
+              <w:t>Rechazar un grupo que no cabe completo en el aforo (RF-1</w:t>
+            </w:r>
+            <w:r>
+              <w:rPr>
+                <w:sz w:val="17"/>
+                <w:szCs w:val="17"/>
+              </w:rPr>
+              <w:t>7</w:t>
+            </w:r>
+            <w:r>
+              <w:rPr>
+                <w:sz w:val="17"/>
+                <w:szCs w:val="17"/>
+              </w:rPr>
+              <w:t>, CU-08).</w:t>
             </w:r>
           </w:p>
         </w:tc>
@@ -38207,23 +39592,7 @@
                 <w:sz w:val="17"/>
                 <w:szCs w:val="17"/>
               </w:rPr>
-              <w:t xml:space="preserve">La zona tiene </w:t>
-            </w:r>
-            <w:proofErr w:type="spellStart"/>
-            <w:r>
-              <w:rPr>
-                <w:sz w:val="17"/>
-                <w:szCs w:val="17"/>
-              </w:rPr>
-              <w:t>ZonCupoMaximoDiario</w:t>
-            </w:r>
-            <w:proofErr w:type="spellEnd"/>
-            <w:r>
-              <w:rPr>
-                <w:sz w:val="17"/>
-                <w:szCs w:val="17"/>
-              </w:rPr>
-              <w:t xml:space="preserve"> configurado y quedan menos cupos libres que integrantes del grupo.</w:t>
+              <w:t>La zona tiene ZonCupoMaximoDiario configurado y quedan menos cupos libres que integrantes del grupo.</w:t>
             </w:r>
           </w:p>
         </w:tc>
@@ -38278,21 +39647,12 @@
             <w:vAlign w:val="center"/>
           </w:tcPr>
           <w:p>
-            <w:proofErr w:type="spellStart"/>
-            <w:r>
-              <w:rPr>
-                <w:sz w:val="17"/>
-                <w:szCs w:val="17"/>
-              </w:rPr>
-              <w:t>ZonaTuristica</w:t>
-            </w:r>
-            <w:proofErr w:type="spellEnd"/>
-            <w:r>
-              <w:rPr>
-                <w:sz w:val="17"/>
-                <w:szCs w:val="17"/>
-              </w:rPr>
-              <w:t>=Conjunto Arqueológico de Ollantaytambo; personas=3; cupos libres=2</w:t>
+            <w:r>
+              <w:rPr>
+                <w:sz w:val="17"/>
+                <w:szCs w:val="17"/>
+              </w:rPr>
+              <w:t>ZonaTuristica=Conjunto Arqueológico de Ollantaytambo; personas=3; cupos libres=2</w:t>
             </w:r>
           </w:p>
         </w:tc>
@@ -38355,12 +39715,6 @@
             <w:vAlign w:val="center"/>
           </w:tcPr>
           <w:p>
-            <w:pPr>
-              <w:rPr>
-                <w:sz w:val="17"/>
-                <w:szCs w:val="17"/>
-              </w:rPr>
-            </w:pPr>
             <w:r>
               <w:rPr>
                 <w:sz w:val="17"/>
@@ -38382,18 +39736,26 @@
             <w:vAlign w:val="center"/>
           </w:tcPr>
           <w:p>
-            <w:pPr>
-              <w:rPr>
-                <w:sz w:val="17"/>
-                <w:szCs w:val="17"/>
-              </w:rPr>
-            </w:pPr>
-            <w:r>
-              <w:rPr>
-                <w:sz w:val="17"/>
-                <w:szCs w:val="17"/>
-              </w:rPr>
-              <w:t>Eliminar un servicio de tren registrado (RF-12, RF-15)</w:t>
+            <w:r>
+              <w:rPr>
+                <w:sz w:val="17"/>
+                <w:szCs w:val="17"/>
+              </w:rPr>
+              <w:t>Consultar historial de informes de planificación de un usuario autenticado (CU-09, RF-1</w:t>
+            </w:r>
+            <w:r>
+              <w:rPr>
+                <w:sz w:val="17"/>
+                <w:szCs w:val="17"/>
+              </w:rPr>
+              <w:t>0</w:t>
+            </w:r>
+            <w:r>
+              <w:rPr>
+                <w:sz w:val="17"/>
+                <w:szCs w:val="17"/>
+              </w:rPr>
+              <w:t>).</w:t>
             </w:r>
           </w:p>
         </w:tc>
@@ -38409,18 +39771,12 @@
             <w:vAlign w:val="center"/>
           </w:tcPr>
           <w:p>
-            <w:pPr>
-              <w:rPr>
-                <w:sz w:val="17"/>
-                <w:szCs w:val="17"/>
-              </w:rPr>
-            </w:pPr>
-            <w:r>
-              <w:rPr>
-                <w:sz w:val="17"/>
-                <w:szCs w:val="17"/>
-              </w:rPr>
-              <w:t>Sesión iniciada con rol PERURAIL_ADMIN o ADMIN_MTC. Existe al menos un servicio de tren en la lista.</w:t>
+            <w:r>
+              <w:rPr>
+                <w:sz w:val="17"/>
+                <w:szCs w:val="17"/>
+              </w:rPr>
+              <w:t>Existe el usuario "turista_jose" registrado con al menos un informe generado en el sistema.</w:t>
             </w:r>
           </w:p>
         </w:tc>
@@ -38436,63 +39792,30 @@
             <w:vAlign w:val="center"/>
           </w:tcPr>
           <w:p>
-            <w:pPr>
-              <w:rPr>
-                <w:sz w:val="17"/>
-                <w:szCs w:val="17"/>
-              </w:rPr>
-            </w:pPr>
-            <w:r>
-              <w:rPr>
-                <w:sz w:val="17"/>
-                <w:szCs w:val="17"/>
-              </w:rPr>
-              <w:t>1) Acceder a "Horarios y tarifas" (/servicios-tren).</w:t>
-            </w:r>
-          </w:p>
-          <w:p>
-            <w:pPr>
-              <w:rPr>
-                <w:sz w:val="17"/>
-                <w:szCs w:val="17"/>
-              </w:rPr>
-            </w:pPr>
-            <w:r>
-              <w:rPr>
-                <w:sz w:val="17"/>
-                <w:szCs w:val="17"/>
-              </w:rPr>
-              <w:t>2) Ubicar el servicio deseado en la tabla.</w:t>
-            </w:r>
-          </w:p>
-          <w:p>
-            <w:pPr>
-              <w:rPr>
-                <w:sz w:val="17"/>
-                <w:szCs w:val="17"/>
-              </w:rPr>
-            </w:pPr>
-            <w:r>
-              <w:rPr>
-                <w:sz w:val="17"/>
-                <w:szCs w:val="17"/>
-              </w:rPr>
-              <w:t>3) Clic en el botón rojo de eliminar (icono papelera).</w:t>
-            </w:r>
-          </w:p>
-          <w:p>
-            <w:pPr>
-              <w:rPr>
-                <w:sz w:val="17"/>
-                <w:szCs w:val="17"/>
-              </w:rPr>
-            </w:pPr>
-            <w:r>
-              <w:rPr>
-                <w:sz w:val="17"/>
-                <w:szCs w:val="17"/>
-              </w:rPr>
-              <w:t>4) Confirmar la alerta de confirmación.</w:t>
+            <w:r>
+              <w:rPr>
+                <w:sz w:val="17"/>
+                <w:szCs w:val="17"/>
+              </w:rPr>
+              <w:t xml:space="preserve">1) Iniciar sesión como "turista_jose". </w:t>
+            </w:r>
+          </w:p>
+          <w:p>
+            <w:r>
+              <w:rPr>
+                <w:sz w:val="17"/>
+                <w:szCs w:val="17"/>
+              </w:rPr>
+              <w:t xml:space="preserve">2) Acceder a la pestaña "Mis Informes". </w:t>
+            </w:r>
+          </w:p>
+          <w:p>
+            <w:r>
+              <w:rPr>
+                <w:sz w:val="17"/>
+                <w:szCs w:val="17"/>
+              </w:rPr>
+              <w:t>3) Verificar los informes y pulsar "Ver" y "PDF".</w:t>
             </w:r>
           </w:p>
         </w:tc>
@@ -38508,18 +39831,12 @@
             <w:vAlign w:val="center"/>
           </w:tcPr>
           <w:p>
-            <w:pPr>
-              <w:rPr>
-                <w:sz w:val="17"/>
-                <w:szCs w:val="17"/>
-              </w:rPr>
-            </w:pPr>
-            <w:r>
-              <w:rPr>
-                <w:sz w:val="17"/>
-                <w:szCs w:val="17"/>
-              </w:rPr>
-              <w:t>ID del servicio existente (ej. Servicio de las 08:30 Ollantaytambo → Aguas Calientes)</w:t>
+            <w:r>
+              <w:rPr>
+                <w:sz w:val="17"/>
+                <w:szCs w:val="17"/>
+              </w:rPr>
+              <w:t>Usuario="turista_jose"; Contraseña="Turista1234"</w:t>
             </w:r>
           </w:p>
         </w:tc>
@@ -38535,50 +39852,12 @@
             <w:vAlign w:val="center"/>
           </w:tcPr>
           <w:p>
-            <w:pPr>
-              <w:rPr>
-                <w:sz w:val="17"/>
-                <w:szCs w:val="17"/>
-              </w:rPr>
-            </w:pPr>
-            <w:r>
-              <w:rPr>
-                <w:sz w:val="17"/>
-                <w:szCs w:val="17"/>
-              </w:rPr>
-              <w:t xml:space="preserve">El servicio se borra de la tabla inmediatamente, se elimina físicamente de la BD y se genera una entrada en </w:t>
-            </w:r>
-            <w:proofErr w:type="spellStart"/>
-            <w:r>
-              <w:rPr>
-                <w:sz w:val="17"/>
-                <w:szCs w:val="17"/>
-              </w:rPr>
-              <w:t>auditoria_log</w:t>
-            </w:r>
-            <w:proofErr w:type="spellEnd"/>
-            <w:r>
-              <w:rPr>
-                <w:sz w:val="17"/>
-                <w:szCs w:val="17"/>
-              </w:rPr>
-              <w:t xml:space="preserve"> con </w:t>
-            </w:r>
-            <w:proofErr w:type="spellStart"/>
-            <w:r>
-              <w:rPr>
-                <w:sz w:val="17"/>
-                <w:szCs w:val="17"/>
-              </w:rPr>
-              <w:t>AudOperacion</w:t>
-            </w:r>
-            <w:proofErr w:type="spellEnd"/>
-            <w:r>
-              <w:rPr>
-                <w:sz w:val="17"/>
-                <w:szCs w:val="17"/>
-              </w:rPr>
-              <w:t xml:space="preserve"> = 'DELETE', guardando el usuario y los datos anteriores.</w:t>
+            <w:r>
+              <w:rPr>
+                <w:sz w:val="17"/>
+                <w:szCs w:val="17"/>
+              </w:rPr>
+              <w:t>El sistema presenta la tabla con los informes emitidos por el usuario en orden cronológico inverso, permite visualizar la versión HTML y descargar el PDF sin consumir aforo. Un usuario no autenticado es redirigido al login.</w:t>
             </w:r>
           </w:p>
         </w:tc>
@@ -38594,12 +39873,6 @@
             <w:vAlign w:val="center"/>
           </w:tcPr>
           <w:p>
-            <w:pPr>
-              <w:rPr>
-                <w:sz w:val="17"/>
-                <w:szCs w:val="17"/>
-              </w:rPr>
-            </w:pPr>
             <w:r>
               <w:rPr>
                 <w:sz w:val="17"/>
@@ -38637,6 +39910,274 @@
                 <w:sz w:val="17"/>
                 <w:szCs w:val="17"/>
               </w:rPr>
+              <w:t>CN-13</w:t>
+            </w:r>
+          </w:p>
+        </w:tc>
+        <w:tc>
+          <w:tcPr>
+            <w:tcW w:w="624" w:type="pct"/>
+            <w:tcMar>
+              <w:top w:w="60" w:type="dxa"/>
+              <w:left w:w="80" w:type="dxa"/>
+              <w:bottom w:w="60" w:type="dxa"/>
+              <w:right w:w="80" w:type="dxa"/>
+            </w:tcMar>
+            <w:vAlign w:val="center"/>
+          </w:tcPr>
+          <w:p>
+            <w:pPr>
+              <w:rPr>
+                <w:sz w:val="17"/>
+                <w:szCs w:val="17"/>
+              </w:rPr>
+            </w:pPr>
+            <w:r>
+              <w:rPr>
+                <w:sz w:val="17"/>
+                <w:szCs w:val="17"/>
+              </w:rPr>
+              <w:t>Eliminar un servicio de tren registrado (RF-1</w:t>
+            </w:r>
+            <w:r>
+              <w:rPr>
+                <w:sz w:val="17"/>
+                <w:szCs w:val="17"/>
+              </w:rPr>
+              <w:t>3</w:t>
+            </w:r>
+            <w:r>
+              <w:rPr>
+                <w:sz w:val="17"/>
+                <w:szCs w:val="17"/>
+              </w:rPr>
+              <w:t>, RF-1</w:t>
+            </w:r>
+            <w:r>
+              <w:rPr>
+                <w:sz w:val="17"/>
+                <w:szCs w:val="17"/>
+              </w:rPr>
+              <w:t>6</w:t>
+            </w:r>
+            <w:r>
+              <w:rPr>
+                <w:sz w:val="17"/>
+                <w:szCs w:val="17"/>
+              </w:rPr>
+              <w:t>)</w:t>
+            </w:r>
+          </w:p>
+        </w:tc>
+        <w:tc>
+          <w:tcPr>
+            <w:tcW w:w="971" w:type="pct"/>
+            <w:tcMar>
+              <w:top w:w="60" w:type="dxa"/>
+              <w:left w:w="80" w:type="dxa"/>
+              <w:bottom w:w="60" w:type="dxa"/>
+              <w:right w:w="80" w:type="dxa"/>
+            </w:tcMar>
+            <w:vAlign w:val="center"/>
+          </w:tcPr>
+          <w:p>
+            <w:pPr>
+              <w:rPr>
+                <w:sz w:val="17"/>
+                <w:szCs w:val="17"/>
+              </w:rPr>
+            </w:pPr>
+            <w:r>
+              <w:rPr>
+                <w:sz w:val="17"/>
+                <w:szCs w:val="17"/>
+              </w:rPr>
+              <w:t>Sesión iniciada con rol PERURAIL_ADMIN o ADMIN_MTC. Existe al menos un servicio de tren en la lista.</w:t>
+            </w:r>
+          </w:p>
+        </w:tc>
+        <w:tc>
+          <w:tcPr>
+            <w:tcW w:w="765" w:type="pct"/>
+            <w:tcMar>
+              <w:top w:w="60" w:type="dxa"/>
+              <w:left w:w="80" w:type="dxa"/>
+              <w:bottom w:w="60" w:type="dxa"/>
+              <w:right w:w="80" w:type="dxa"/>
+            </w:tcMar>
+            <w:vAlign w:val="center"/>
+          </w:tcPr>
+          <w:p>
+            <w:pPr>
+              <w:rPr>
+                <w:sz w:val="17"/>
+                <w:szCs w:val="17"/>
+              </w:rPr>
+            </w:pPr>
+            <w:r>
+              <w:rPr>
+                <w:sz w:val="17"/>
+                <w:szCs w:val="17"/>
+              </w:rPr>
+              <w:t>1) Acceder a "Horarios y tarifas" (/servicios-tren).</w:t>
+            </w:r>
+          </w:p>
+          <w:p>
+            <w:pPr>
+              <w:rPr>
+                <w:sz w:val="17"/>
+                <w:szCs w:val="17"/>
+              </w:rPr>
+            </w:pPr>
+            <w:r>
+              <w:rPr>
+                <w:sz w:val="17"/>
+                <w:szCs w:val="17"/>
+              </w:rPr>
+              <w:t>2) Ubicar el servicio deseado en la tabla.</w:t>
+            </w:r>
+          </w:p>
+          <w:p>
+            <w:pPr>
+              <w:rPr>
+                <w:sz w:val="17"/>
+                <w:szCs w:val="17"/>
+              </w:rPr>
+            </w:pPr>
+            <w:r>
+              <w:rPr>
+                <w:sz w:val="17"/>
+                <w:szCs w:val="17"/>
+              </w:rPr>
+              <w:t>3) Clic en el botón rojo de eliminar (icono papelera).</w:t>
+            </w:r>
+          </w:p>
+          <w:p>
+            <w:pPr>
+              <w:rPr>
+                <w:sz w:val="17"/>
+                <w:szCs w:val="17"/>
+              </w:rPr>
+            </w:pPr>
+            <w:r>
+              <w:rPr>
+                <w:sz w:val="17"/>
+                <w:szCs w:val="17"/>
+              </w:rPr>
+              <w:t>4) Confirmar la alerta de confirmación.</w:t>
+            </w:r>
+          </w:p>
+        </w:tc>
+        <w:tc>
+          <w:tcPr>
+            <w:tcW w:w="1316" w:type="pct"/>
+            <w:tcMar>
+              <w:top w:w="60" w:type="dxa"/>
+              <w:left w:w="80" w:type="dxa"/>
+              <w:bottom w:w="60" w:type="dxa"/>
+              <w:right w:w="80" w:type="dxa"/>
+            </w:tcMar>
+            <w:vAlign w:val="center"/>
+          </w:tcPr>
+          <w:p>
+            <w:pPr>
+              <w:rPr>
+                <w:sz w:val="17"/>
+                <w:szCs w:val="17"/>
+              </w:rPr>
+            </w:pPr>
+            <w:r>
+              <w:rPr>
+                <w:sz w:val="17"/>
+                <w:szCs w:val="17"/>
+              </w:rPr>
+              <w:t>ID del servicio existente (ej. Servicio de las 08:30 Ollantaytambo → Aguas Calientes)</w:t>
+            </w:r>
+          </w:p>
+        </w:tc>
+        <w:tc>
+          <w:tcPr>
+            <w:tcW w:w="761" w:type="pct"/>
+            <w:tcMar>
+              <w:top w:w="60" w:type="dxa"/>
+              <w:left w:w="80" w:type="dxa"/>
+              <w:bottom w:w="60" w:type="dxa"/>
+              <w:right w:w="80" w:type="dxa"/>
+            </w:tcMar>
+            <w:vAlign w:val="center"/>
+          </w:tcPr>
+          <w:p>
+            <w:pPr>
+              <w:rPr>
+                <w:sz w:val="17"/>
+                <w:szCs w:val="17"/>
+              </w:rPr>
+            </w:pPr>
+            <w:r>
+              <w:rPr>
+                <w:sz w:val="17"/>
+                <w:szCs w:val="17"/>
+              </w:rPr>
+              <w:t>El servicio se borra de la tabla inmediatamente, se elimina físicamente de la BD y se genera una entrada en auditoria_log con AudOperacion = 'DELETE', guardando el usuario y los datos anteriores.</w:t>
+            </w:r>
+          </w:p>
+        </w:tc>
+        <w:tc>
+          <w:tcPr>
+            <w:tcW w:w="346" w:type="pct"/>
+            <w:tcMar>
+              <w:top w:w="60" w:type="dxa"/>
+              <w:left w:w="80" w:type="dxa"/>
+              <w:bottom w:w="60" w:type="dxa"/>
+              <w:right w:w="80" w:type="dxa"/>
+            </w:tcMar>
+            <w:vAlign w:val="center"/>
+          </w:tcPr>
+          <w:p>
+            <w:pPr>
+              <w:rPr>
+                <w:sz w:val="17"/>
+                <w:szCs w:val="17"/>
+              </w:rPr>
+            </w:pPr>
+            <w:r>
+              <w:rPr>
+                <w:sz w:val="17"/>
+                <w:szCs w:val="17"/>
+              </w:rPr>
+              <w:t>Exitoso</w:t>
+            </w:r>
+          </w:p>
+        </w:tc>
+      </w:tr>
+      <w:tr>
+        <w:trPr>
+          <w:cantSplit/>
+        </w:trPr>
+        <w:tc>
+          <w:tcPr>
+            <w:tcW w:w="217" w:type="pct"/>
+            <w:tcMar>
+              <w:top w:w="60" w:type="dxa"/>
+              <w:left w:w="80" w:type="dxa"/>
+              <w:bottom w:w="60" w:type="dxa"/>
+              <w:right w:w="80" w:type="dxa"/>
+            </w:tcMar>
+            <w:vAlign w:val="center"/>
+          </w:tcPr>
+          <w:p>
+            <w:pPr>
+              <w:rPr>
+                <w:sz w:val="17"/>
+                <w:szCs w:val="17"/>
+              </w:rPr>
+            </w:pPr>
+            <w:r>
+              <w:rPr>
+                <w:sz w:val="17"/>
+                <w:szCs w:val="17"/>
+              </w:rPr>
+              <w:lastRenderedPageBreak/>
               <w:t>CN-14</w:t>
             </w:r>
           </w:p>
@@ -38718,23 +40259,7 @@
                 <w:sz w:val="17"/>
                 <w:szCs w:val="17"/>
               </w:rPr>
-              <w:t xml:space="preserve">1) Elegir estación y zona turística (ej. Ollantaytambo → Colcas de </w:t>
-            </w:r>
-            <w:proofErr w:type="spellStart"/>
-            <w:r>
-              <w:rPr>
-                <w:sz w:val="17"/>
-                <w:szCs w:val="17"/>
-              </w:rPr>
-              <w:t>Pinkuylluna</w:t>
-            </w:r>
-            <w:proofErr w:type="spellEnd"/>
-            <w:r>
-              <w:rPr>
-                <w:sz w:val="17"/>
-                <w:szCs w:val="17"/>
-              </w:rPr>
-              <w:t>).</w:t>
+              <w:t>1) Elegir estación y zona turística (ej. Ollantaytambo → Colcas de Pinkuylluna).</w:t>
             </w:r>
           </w:p>
           <w:p>
@@ -38818,39 +40343,7 @@
                 <w:sz w:val="17"/>
                 <w:szCs w:val="17"/>
               </w:rPr>
-              <w:t xml:space="preserve">El mapa </w:t>
-            </w:r>
-            <w:proofErr w:type="spellStart"/>
-            <w:r>
-              <w:rPr>
-                <w:sz w:val="17"/>
-                <w:szCs w:val="17"/>
-              </w:rPr>
-              <w:t>Leaflet</w:t>
-            </w:r>
-            <w:proofErr w:type="spellEnd"/>
-            <w:r>
-              <w:rPr>
-                <w:sz w:val="17"/>
-                <w:szCs w:val="17"/>
-              </w:rPr>
-              <w:t xml:space="preserve"> dibuja una línea continua que sigue las curvas y calles peatonales de </w:t>
-            </w:r>
-            <w:proofErr w:type="spellStart"/>
-            <w:r>
-              <w:rPr>
-                <w:sz w:val="17"/>
-                <w:szCs w:val="17"/>
-              </w:rPr>
-              <w:t>OpenStreetMap</w:t>
-            </w:r>
-            <w:proofErr w:type="spellEnd"/>
-            <w:r>
-              <w:rPr>
-                <w:sz w:val="17"/>
-                <w:szCs w:val="17"/>
-              </w:rPr>
-              <w:t xml:space="preserve"> entre la estación y el punto de interés, sin líneas sobrantes, y el pie de mapa reporta la distancia real por calles.</w:t>
+              <w:t>El mapa Leaflet dibuja una línea continua que sigue las curvas y calles peatonales de OpenStreetMap entre la estación y el punto de interés, sin líneas sobrantes, y el pie de mapa reporta la distancia real por calles.</w:t>
             </w:r>
           </w:p>
         </w:tc>
@@ -40015,6 +41508,119 @@
     </w:lvl>
   </w:abstractNum>
   <w:abstractNum w:abstractNumId="9" w15:restartNumberingAfterBreak="0">
+    <w:nsid w:val="280322AE"/>
+    <w:multiLevelType w:val="hybridMultilevel"/>
+    <w:tmpl w:val="9426FBE8"/>
+    <w:lvl w:ilvl="0" w:tplc="280A0001">
+      <w:start w:val="1"/>
+      <w:numFmt w:val="bullet"/>
+      <w:lvlText w:val=""/>
+      <w:lvlJc w:val="left"/>
+      <w:pPr>
+        <w:ind w:left="720" w:hanging="360"/>
+      </w:pPr>
+      <w:rPr>
+        <w:rFonts w:ascii="Symbol" w:hAnsi="Symbol" w:hint="default"/>
+      </w:rPr>
+    </w:lvl>
+    <w:lvl w:ilvl="1" w:tplc="280A0003" w:tentative="1">
+      <w:start w:val="1"/>
+      <w:numFmt w:val="bullet"/>
+      <w:lvlText w:val="o"/>
+      <w:lvlJc w:val="left"/>
+      <w:pPr>
+        <w:ind w:left="1440" w:hanging="360"/>
+      </w:pPr>
+      <w:rPr>
+        <w:rFonts w:ascii="Courier New" w:hAnsi="Courier New" w:cs="Courier New" w:hint="default"/>
+      </w:rPr>
+    </w:lvl>
+    <w:lvl w:ilvl="2" w:tplc="280A0005" w:tentative="1">
+      <w:start w:val="1"/>
+      <w:numFmt w:val="bullet"/>
+      <w:lvlText w:val=""/>
+      <w:lvlJc w:val="left"/>
+      <w:pPr>
+        <w:ind w:left="2160" w:hanging="360"/>
+      </w:pPr>
+      <w:rPr>
+        <w:rFonts w:ascii="Wingdings" w:hAnsi="Wingdings" w:hint="default"/>
+      </w:rPr>
+    </w:lvl>
+    <w:lvl w:ilvl="3" w:tplc="280A0001" w:tentative="1">
+      <w:start w:val="1"/>
+      <w:numFmt w:val="bullet"/>
+      <w:lvlText w:val=""/>
+      <w:lvlJc w:val="left"/>
+      <w:pPr>
+        <w:ind w:left="2880" w:hanging="360"/>
+      </w:pPr>
+      <w:rPr>
+        <w:rFonts w:ascii="Symbol" w:hAnsi="Symbol" w:hint="default"/>
+      </w:rPr>
+    </w:lvl>
+    <w:lvl w:ilvl="4" w:tplc="280A0003" w:tentative="1">
+      <w:start w:val="1"/>
+      <w:numFmt w:val="bullet"/>
+      <w:lvlText w:val="o"/>
+      <w:lvlJc w:val="left"/>
+      <w:pPr>
+        <w:ind w:left="3600" w:hanging="360"/>
+      </w:pPr>
+      <w:rPr>
+        <w:rFonts w:ascii="Courier New" w:hAnsi="Courier New" w:cs="Courier New" w:hint="default"/>
+      </w:rPr>
+    </w:lvl>
+    <w:lvl w:ilvl="5" w:tplc="280A0005" w:tentative="1">
+      <w:start w:val="1"/>
+      <w:numFmt w:val="bullet"/>
+      <w:lvlText w:val=""/>
+      <w:lvlJc w:val="left"/>
+      <w:pPr>
+        <w:ind w:left="4320" w:hanging="360"/>
+      </w:pPr>
+      <w:rPr>
+        <w:rFonts w:ascii="Wingdings" w:hAnsi="Wingdings" w:hint="default"/>
+      </w:rPr>
+    </w:lvl>
+    <w:lvl w:ilvl="6" w:tplc="280A0001" w:tentative="1">
+      <w:start w:val="1"/>
+      <w:numFmt w:val="bullet"/>
+      <w:lvlText w:val=""/>
+      <w:lvlJc w:val="left"/>
+      <w:pPr>
+        <w:ind w:left="5040" w:hanging="360"/>
+      </w:pPr>
+      <w:rPr>
+        <w:rFonts w:ascii="Symbol" w:hAnsi="Symbol" w:hint="default"/>
+      </w:rPr>
+    </w:lvl>
+    <w:lvl w:ilvl="7" w:tplc="280A0003" w:tentative="1">
+      <w:start w:val="1"/>
+      <w:numFmt w:val="bullet"/>
+      <w:lvlText w:val="o"/>
+      <w:lvlJc w:val="left"/>
+      <w:pPr>
+        <w:ind w:left="5760" w:hanging="360"/>
+      </w:pPr>
+      <w:rPr>
+        <w:rFonts w:ascii="Courier New" w:hAnsi="Courier New" w:cs="Courier New" w:hint="default"/>
+      </w:rPr>
+    </w:lvl>
+    <w:lvl w:ilvl="8" w:tplc="280A0005" w:tentative="1">
+      <w:start w:val="1"/>
+      <w:numFmt w:val="bullet"/>
+      <w:lvlText w:val=""/>
+      <w:lvlJc w:val="left"/>
+      <w:pPr>
+        <w:ind w:left="6480" w:hanging="360"/>
+      </w:pPr>
+      <w:rPr>
+        <w:rFonts w:ascii="Wingdings" w:hAnsi="Wingdings" w:hint="default"/>
+      </w:rPr>
+    </w:lvl>
+  </w:abstractNum>
+  <w:abstractNum w:abstractNumId="10" w15:restartNumberingAfterBreak="0">
     <w:nsid w:val="2EF3570B"/>
     <w:multiLevelType w:val="hybridMultilevel"/>
     <w:tmpl w:val="FECEC160"/>
@@ -40129,7 +41735,7 @@
       </w:rPr>
     </w:lvl>
   </w:abstractNum>
-  <w:abstractNum w:abstractNumId="10" w15:restartNumberingAfterBreak="0">
+  <w:abstractNum w:abstractNumId="11" w15:restartNumberingAfterBreak="0">
     <w:nsid w:val="333A0534"/>
     <w:multiLevelType w:val="hybridMultilevel"/>
     <w:tmpl w:val="94BEA346"/>
@@ -40242,7 +41848,7 @@
       </w:rPr>
     </w:lvl>
   </w:abstractNum>
-  <w:abstractNum w:abstractNumId="11" w15:restartNumberingAfterBreak="0">
+  <w:abstractNum w:abstractNumId="12" w15:restartNumberingAfterBreak="0">
     <w:nsid w:val="36B90B61"/>
     <w:multiLevelType w:val="hybridMultilevel"/>
     <w:tmpl w:val="921CD510"/>
@@ -40355,7 +41961,7 @@
       </w:rPr>
     </w:lvl>
   </w:abstractNum>
-  <w:abstractNum w:abstractNumId="12" w15:restartNumberingAfterBreak="0">
+  <w:abstractNum w:abstractNumId="13" w15:restartNumberingAfterBreak="0">
     <w:nsid w:val="379346B3"/>
     <w:multiLevelType w:val="hybridMultilevel"/>
     <w:tmpl w:val="F092B52A"/>
@@ -40468,7 +42074,7 @@
       </w:rPr>
     </w:lvl>
   </w:abstractNum>
-  <w:abstractNum w:abstractNumId="13" w15:restartNumberingAfterBreak="0">
+  <w:abstractNum w:abstractNumId="14" w15:restartNumberingAfterBreak="0">
     <w:nsid w:val="3DD14B70"/>
     <w:multiLevelType w:val="hybridMultilevel"/>
     <w:tmpl w:val="89B422FE"/>
@@ -40581,7 +42187,7 @@
       </w:rPr>
     </w:lvl>
   </w:abstractNum>
-  <w:abstractNum w:abstractNumId="14" w15:restartNumberingAfterBreak="0">
+  <w:abstractNum w:abstractNumId="15" w15:restartNumberingAfterBreak="0">
     <w:nsid w:val="44152A2C"/>
     <w:multiLevelType w:val="hybridMultilevel"/>
     <w:tmpl w:val="45F2D8F8"/>
@@ -40694,7 +42300,7 @@
       </w:rPr>
     </w:lvl>
   </w:abstractNum>
-  <w:abstractNum w:abstractNumId="15" w15:restartNumberingAfterBreak="0">
+  <w:abstractNum w:abstractNumId="16" w15:restartNumberingAfterBreak="0">
     <w:nsid w:val="46950EDB"/>
     <w:multiLevelType w:val="hybridMultilevel"/>
     <w:tmpl w:val="50880282"/>
@@ -40809,7 +42415,7 @@
       </w:rPr>
     </w:lvl>
   </w:abstractNum>
-  <w:abstractNum w:abstractNumId="16" w15:restartNumberingAfterBreak="0">
+  <w:abstractNum w:abstractNumId="17" w15:restartNumberingAfterBreak="0">
     <w:nsid w:val="4A6B2501"/>
     <w:multiLevelType w:val="hybridMultilevel"/>
     <w:tmpl w:val="A920CCE2"/>
@@ -40924,7 +42530,7 @@
       </w:rPr>
     </w:lvl>
   </w:abstractNum>
-  <w:abstractNum w:abstractNumId="17" w15:restartNumberingAfterBreak="0">
+  <w:abstractNum w:abstractNumId="18" w15:restartNumberingAfterBreak="0">
     <w:nsid w:val="4A9D1A76"/>
     <w:multiLevelType w:val="hybridMultilevel"/>
     <w:tmpl w:val="9D486AA0"/>
@@ -41037,7 +42643,7 @@
       </w:rPr>
     </w:lvl>
   </w:abstractNum>
-  <w:abstractNum w:abstractNumId="18" w15:restartNumberingAfterBreak="0">
+  <w:abstractNum w:abstractNumId="19" w15:restartNumberingAfterBreak="0">
     <w:nsid w:val="53E77DB3"/>
     <w:multiLevelType w:val="hybridMultilevel"/>
     <w:tmpl w:val="01E28886"/>
@@ -41150,7 +42756,7 @@
       </w:rPr>
     </w:lvl>
   </w:abstractNum>
-  <w:abstractNum w:abstractNumId="19" w15:restartNumberingAfterBreak="0">
+  <w:abstractNum w:abstractNumId="20" w15:restartNumberingAfterBreak="0">
     <w:nsid w:val="56FC527F"/>
     <w:multiLevelType w:val="hybridMultilevel"/>
     <w:tmpl w:val="55421CD8"/>
@@ -41263,7 +42869,7 @@
       </w:rPr>
     </w:lvl>
   </w:abstractNum>
-  <w:abstractNum w:abstractNumId="20" w15:restartNumberingAfterBreak="0">
+  <w:abstractNum w:abstractNumId="21" w15:restartNumberingAfterBreak="0">
     <w:nsid w:val="584C2D67"/>
     <w:multiLevelType w:val="hybridMultilevel"/>
     <w:tmpl w:val="9034861A"/>
@@ -41378,7 +42984,7 @@
       </w:rPr>
     </w:lvl>
   </w:abstractNum>
-  <w:abstractNum w:abstractNumId="21" w15:restartNumberingAfterBreak="0">
+  <w:abstractNum w:abstractNumId="22" w15:restartNumberingAfterBreak="0">
     <w:nsid w:val="5C23046B"/>
     <w:multiLevelType w:val="hybridMultilevel"/>
     <w:tmpl w:val="4C9EDD98"/>
@@ -41491,7 +43097,7 @@
       </w:rPr>
     </w:lvl>
   </w:abstractNum>
-  <w:abstractNum w:abstractNumId="22" w15:restartNumberingAfterBreak="0">
+  <w:abstractNum w:abstractNumId="23" w15:restartNumberingAfterBreak="0">
     <w:nsid w:val="63145090"/>
     <w:multiLevelType w:val="hybridMultilevel"/>
     <w:tmpl w:val="DE20FE26"/>
@@ -41604,7 +43210,7 @@
       </w:rPr>
     </w:lvl>
   </w:abstractNum>
-  <w:abstractNum w:abstractNumId="23" w15:restartNumberingAfterBreak="0">
+  <w:abstractNum w:abstractNumId="24" w15:restartNumberingAfterBreak="0">
     <w:nsid w:val="64EE50CA"/>
     <w:multiLevelType w:val="hybridMultilevel"/>
     <w:tmpl w:val="17EE7074"/>
@@ -41717,7 +43323,7 @@
       </w:rPr>
     </w:lvl>
   </w:abstractNum>
-  <w:abstractNum w:abstractNumId="24" w15:restartNumberingAfterBreak="0">
+  <w:abstractNum w:abstractNumId="25" w15:restartNumberingAfterBreak="0">
     <w:nsid w:val="66E76A8C"/>
     <w:multiLevelType w:val="hybridMultilevel"/>
     <w:tmpl w:val="A94C5626"/>
@@ -41830,7 +43436,7 @@
       </w:rPr>
     </w:lvl>
   </w:abstractNum>
-  <w:abstractNum w:abstractNumId="25" w15:restartNumberingAfterBreak="0">
+  <w:abstractNum w:abstractNumId="26" w15:restartNumberingAfterBreak="0">
     <w:nsid w:val="68781600"/>
     <w:multiLevelType w:val="hybridMultilevel"/>
     <w:tmpl w:val="67801904"/>
@@ -41943,7 +43549,7 @@
       </w:rPr>
     </w:lvl>
   </w:abstractNum>
-  <w:abstractNum w:abstractNumId="26" w15:restartNumberingAfterBreak="0">
+  <w:abstractNum w:abstractNumId="27" w15:restartNumberingAfterBreak="0">
     <w:nsid w:val="6FBC4BB2"/>
     <w:multiLevelType w:val="hybridMultilevel"/>
     <w:tmpl w:val="59D0DEA6"/>
@@ -42056,7 +43662,7 @@
       </w:rPr>
     </w:lvl>
   </w:abstractNum>
-  <w:abstractNum w:abstractNumId="27" w15:restartNumberingAfterBreak="0">
+  <w:abstractNum w:abstractNumId="28" w15:restartNumberingAfterBreak="0">
     <w:nsid w:val="72086B35"/>
     <w:multiLevelType w:val="hybridMultilevel"/>
     <w:tmpl w:val="C546C3CE"/>
@@ -42142,7 +43748,7 @@
       </w:pPr>
     </w:lvl>
   </w:abstractNum>
-  <w:abstractNum w:abstractNumId="28" w15:restartNumberingAfterBreak="0">
+  <w:abstractNum w:abstractNumId="29" w15:restartNumberingAfterBreak="0">
     <w:nsid w:val="76335502"/>
     <w:multiLevelType w:val="hybridMultilevel"/>
     <w:tmpl w:val="F04424FE"/>
@@ -42257,7 +43863,7 @@
       </w:rPr>
     </w:lvl>
   </w:abstractNum>
-  <w:abstractNum w:abstractNumId="29" w15:restartNumberingAfterBreak="0">
+  <w:abstractNum w:abstractNumId="30" w15:restartNumberingAfterBreak="0">
     <w:nsid w:val="79365B0D"/>
     <w:multiLevelType w:val="hybridMultilevel"/>
     <w:tmpl w:val="B0C65392"/>
@@ -42374,19 +43980,19 @@
     <w:abstractNumId w:val="3"/>
   </w:num>
   <w:num w:numId="2" w16cid:durableId="768231209">
-    <w:abstractNumId w:val="14"/>
+    <w:abstractNumId w:val="15"/>
   </w:num>
   <w:num w:numId="3" w16cid:durableId="1763140486">
-    <w:abstractNumId w:val="17"/>
+    <w:abstractNumId w:val="18"/>
   </w:num>
   <w:num w:numId="4" w16cid:durableId="157888014">
     <w:abstractNumId w:val="4"/>
   </w:num>
   <w:num w:numId="5" w16cid:durableId="955909001">
-    <w:abstractNumId w:val="13"/>
+    <w:abstractNumId w:val="14"/>
   </w:num>
   <w:num w:numId="6" w16cid:durableId="1586062912">
-    <w:abstractNumId w:val="23"/>
+    <w:abstractNumId w:val="24"/>
   </w:num>
   <w:num w:numId="7" w16cid:durableId="525942684">
     <w:abstractNumId w:val="5"/>
@@ -42395,37 +44001,37 @@
     <w:abstractNumId w:val="8"/>
   </w:num>
   <w:num w:numId="9" w16cid:durableId="1686786859">
-    <w:abstractNumId w:val="24"/>
+    <w:abstractNumId w:val="25"/>
   </w:num>
   <w:num w:numId="10" w16cid:durableId="582959157">
-    <w:abstractNumId w:val="25"/>
+    <w:abstractNumId w:val="26"/>
   </w:num>
   <w:num w:numId="11" w16cid:durableId="2077512816">
     <w:abstractNumId w:val="7"/>
   </w:num>
   <w:num w:numId="12" w16cid:durableId="1346130477">
-    <w:abstractNumId w:val="18"/>
+    <w:abstractNumId w:val="19"/>
   </w:num>
   <w:num w:numId="13" w16cid:durableId="522944055">
-    <w:abstractNumId w:val="20"/>
+    <w:abstractNumId w:val="21"/>
   </w:num>
   <w:num w:numId="14" w16cid:durableId="1641692727">
-    <w:abstractNumId w:val="28"/>
+    <w:abstractNumId w:val="29"/>
   </w:num>
   <w:num w:numId="15" w16cid:durableId="642779006">
-    <w:abstractNumId w:val="9"/>
+    <w:abstractNumId w:val="10"/>
   </w:num>
   <w:num w:numId="16" w16cid:durableId="269243821">
     <w:abstractNumId w:val="6"/>
   </w:num>
   <w:num w:numId="17" w16cid:durableId="1038772883">
-    <w:abstractNumId w:val="15"/>
+    <w:abstractNumId w:val="16"/>
   </w:num>
   <w:num w:numId="18" w16cid:durableId="1874033540">
-    <w:abstractNumId w:val="16"/>
+    <w:abstractNumId w:val="17"/>
   </w:num>
   <w:num w:numId="19" w16cid:durableId="760949033">
-    <w:abstractNumId w:val="12"/>
+    <w:abstractNumId w:val="13"/>
   </w:num>
   <w:num w:numId="20" w16cid:durableId="1843662097">
     <w:abstractNumId w:val="2"/>
@@ -42437,28 +44043,31 @@
     <w:abstractNumId w:val="1"/>
   </w:num>
   <w:num w:numId="23" w16cid:durableId="253517565">
+    <w:abstractNumId w:val="23"/>
+  </w:num>
+  <w:num w:numId="24" w16cid:durableId="2049723296">
+    <w:abstractNumId w:val="27"/>
+  </w:num>
+  <w:num w:numId="25" w16cid:durableId="876157561">
+    <w:abstractNumId w:val="20"/>
+  </w:num>
+  <w:num w:numId="26" w16cid:durableId="1183663820">
+    <w:abstractNumId w:val="12"/>
+  </w:num>
+  <w:num w:numId="27" w16cid:durableId="653723282">
+    <w:abstractNumId w:val="11"/>
+  </w:num>
+  <w:num w:numId="28" w16cid:durableId="142284599">
     <w:abstractNumId w:val="22"/>
   </w:num>
-  <w:num w:numId="24" w16cid:durableId="2049723296">
-    <w:abstractNumId w:val="26"/>
-  </w:num>
-  <w:num w:numId="25" w16cid:durableId="876157561">
-    <w:abstractNumId w:val="19"/>
-  </w:num>
-  <w:num w:numId="26" w16cid:durableId="1183663820">
-    <w:abstractNumId w:val="11"/>
-  </w:num>
-  <w:num w:numId="27" w16cid:durableId="653723282">
-    <w:abstractNumId w:val="10"/>
-  </w:num>
-  <w:num w:numId="28" w16cid:durableId="142284599">
-    <w:abstractNumId w:val="21"/>
-  </w:num>
   <w:num w:numId="29" w16cid:durableId="1198589194">
-    <w:abstractNumId w:val="29"/>
+    <w:abstractNumId w:val="30"/>
   </w:num>
   <w:num w:numId="30" w16cid:durableId="582684716">
-    <w:abstractNumId w:val="27"/>
+    <w:abstractNumId w:val="28"/>
+  </w:num>
+  <w:num w:numId="31" w16cid:durableId="1535196207">
+    <w:abstractNumId w:val="9"/>
   </w:num>
 </w:numbering>
 </file>
@@ -43076,6 +44685,7 @@
   <w:style w:type="character" w:default="1" w:styleId="Fuentedeprrafopredeter">
     <w:name w:val="Default Paragraph Font"/>
     <w:uiPriority w:val="1"/>
+    <w:semiHidden/>
     <w:unhideWhenUsed/>
   </w:style>
   <w:style w:type="table" w:default="1" w:styleId="Tablanormal">

</xml_diff>